<commit_message>
chore(db): update SQLite database with seeded stakeholder accounts, schema tables, and requirements
</commit_message>
<xml_diff>
--- a/task.docx
+++ b/task.docx
@@ -1,25 +1,18 @@
 
 <file path=word/document.xml><?xml version="1.0" encoding="utf-8"?>
-<w:document xmlns:w="http://schemas.openxmlformats.org/wordprocessingml/2006/main" xmlns:r="http://schemas.openxmlformats.org/officeDocument/2006/relationships" xmlns:wp="http://schemas.openxmlformats.org/drawingml/2006/wordprocessingDrawing" xmlns:a="http://schemas.openxmlformats.org/drawingml/2006/main" xmlns:pic="http://schemas.openxmlformats.org/drawingml/2006/picture">
+<w:document xmlns:wpc="http://schemas.microsoft.com/office/word/2010/wordprocessingCanvas" xmlns:cx="http://schemas.microsoft.com/office/drawing/2014/chartex" xmlns:cx1="http://schemas.microsoft.com/office/drawing/2015/9/8/chartex" xmlns:cx2="http://schemas.microsoft.com/office/drawing/2015/10/21/chartex" xmlns:cx3="http://schemas.microsoft.com/office/drawing/2016/5/9/chartex" xmlns:cx4="http://schemas.microsoft.com/office/drawing/2016/5/10/chartex" xmlns:cx5="http://schemas.microsoft.com/office/drawing/2016/5/11/chartex" xmlns:cx6="http://schemas.microsoft.com/office/drawing/2016/5/12/chartex" xmlns:cx7="http://schemas.microsoft.com/office/drawing/2016/5/13/chartex" xmlns:cx8="http://schemas.microsoft.com/office/drawing/2016/5/14/chartex" xmlns:mc="http://schemas.openxmlformats.org/markup-compatibility/2006" xmlns:aink="http://schemas.microsoft.com/office/drawing/2016/ink" xmlns:am3d="http://schemas.microsoft.com/office/drawing/2017/model3d" xmlns:o="urn:schemas-microsoft-com:office:office" xmlns:oel="http://schemas.microsoft.com/office/2019/extlst" xmlns:r="http://schemas.openxmlformats.org/officeDocument/2006/relationships" xmlns:m="http://schemas.openxmlformats.org/officeDocument/2006/math" xmlns:v="urn:schemas-microsoft-com:vml" xmlns:wp14="http://schemas.microsoft.com/office/word/2010/wordprocessingDrawing" xmlns:wp="http://schemas.openxmlformats.org/drawingml/2006/wordprocessingDrawing" xmlns:w10="urn:schemas-microsoft-com:office:word" xmlns:w="http://schemas.openxmlformats.org/wordprocessingml/2006/main" xmlns:w14="http://schemas.microsoft.com/office/word/2010/wordml" xmlns:w15="http://schemas.microsoft.com/office/word/2012/wordml" xmlns:w16cex="http://schemas.microsoft.com/office/word/2018/wordml/cex" xmlns:w16cid="http://schemas.microsoft.com/office/word/2016/wordml/cid" xmlns:w16="http://schemas.microsoft.com/office/word/2018/wordml" xmlns:w16du="http://schemas.microsoft.com/office/word/2023/wordml/word16du" xmlns:w16sdtdh="http://schemas.microsoft.com/office/word/2020/wordml/sdtdatahash" xmlns:w16sdtfl="http://schemas.microsoft.com/office/word/2024/wordml/sdtformatlock" xmlns:w16se="http://schemas.microsoft.com/office/word/2015/wordml/symex" xmlns:wpg="http://schemas.microsoft.com/office/word/2010/wordprocessingGroup" xmlns:wpi="http://schemas.microsoft.com/office/word/2010/wordprocessingInk" xmlns:wne="http://schemas.microsoft.com/office/word/2006/wordml" xmlns:wps="http://schemas.microsoft.com/office/word/2010/wordprocessingShape" mc:Ignorable="w14 w15 w16se w16cid w16 w16cex w16sdtdh w16sdtfl w16du wp14">
   <w:body>
     <w:p>
       <w:pPr>
         <w:pStyle w:val="Heading1"/>
       </w:pPr>
       <w:r>
-        <w:t xml:space="preserve">PRD: Chatbot Admin Panel &amp; Analytics Dashboard</w:t>
-      </w:r>
-    </w:p>
-    <w:p>
-      <w:pPr/>
-      <w:r>
-        <w:t xml:space="preserve">Oct 1, 2026</w:t>
-      </w:r>
-      <w:r>
-        <w:t xml:space="preserve"> · </w:t>
-      </w:r>
-      <w:r>
-        <w:t xml:space="preserve">@Clinderma</w:t>
+        <w:t>PRD: Chatbot Admin Panel &amp; Analytics Dashboard</w:t>
+      </w:r>
+    </w:p>
+    <w:p>
+      <w:r>
+        <w:t>Oct 1, 2026 · @Clinderma</w:t>
       </w:r>
     </w:p>
     <w:p>
@@ -27,13 +20,12 @@
         <w:pStyle w:val="Heading2"/>
       </w:pPr>
       <w:r>
-        <w:t xml:space="preserve">Background</w:t>
-      </w:r>
-    </w:p>
-    <w:p>
-      <w:pPr/>
-      <w:r>
-        <w:t xml:space="preserve">The chatbot is built and answers customers' basic questions. Before it goes live on the website, two things are needed:</w:t>
+        <w:t>Background</w:t>
+      </w:r>
+    </w:p>
+    <w:p>
+      <w:r>
+        <w:t>The chatbot is built and answers customers' basic questions. Before it goes live on the website, two things are needed:</w:t>
       </w:r>
     </w:p>
     <w:p>
@@ -48,10 +40,18 @@
         <w:rPr>
           <w:b/>
         </w:rPr>
-        <w:t xml:space="preserve">Admin Panel:</w:t>
-      </w:r>
-      <w:r>
-        <w:t xml:space="preserve"> so the team can update the chatbot's content and offers, test changes before they go live, read and join customer chats, and have doctors review medical answers.</w:t>
+        <w:t>Admin Panel:</w:t>
+      </w:r>
+      <w:r>
+        <w:t xml:space="preserve"> </w:t>
+      </w:r>
+      <w:proofErr w:type="gramStart"/>
+      <w:r>
+        <w:t>so</w:t>
+      </w:r>
+      <w:proofErr w:type="gramEnd"/>
+      <w:r>
+        <w:t xml:space="preserve"> the team can update the chatbot's content and offers, test changes before they go live, read and join customer chats, and have doctors review medical answers.</w:t>
       </w:r>
     </w:p>
     <w:p>
@@ -66,10 +66,18 @@
         <w:rPr>
           <w:b/>
         </w:rPr>
-        <w:t xml:space="preserve">Analytics Dashboard:</w:t>
-      </w:r>
-      <w:r>
-        <w:t xml:space="preserve"> so the team can see how many visitors use the chatbot, where they drop off, and how many orders and how much revenue it brings in.</w:t>
+        <w:t>Analytics Dashboard:</w:t>
+      </w:r>
+      <w:r>
+        <w:t xml:space="preserve"> </w:t>
+      </w:r>
+      <w:proofErr w:type="gramStart"/>
+      <w:r>
+        <w:t>so</w:t>
+      </w:r>
+      <w:proofErr w:type="gramEnd"/>
+      <w:r>
+        <w:t xml:space="preserve"> the team can see how many visitors use the chatbot, where they drop off, and how many orders and how much revenue it brings in.</w:t>
       </w:r>
     </w:p>
     <w:p>
@@ -77,13 +85,12 @@
         <w:pStyle w:val="Heading2"/>
       </w:pPr>
       <w:r>
-        <w:t xml:space="preserve">Roles and permissions</w:t>
-      </w:r>
-    </w:p>
-    <w:p>
-      <w:pPr/>
-      <w:r>
-        <w:t xml:space="preserve">There are three roles. Admins have full access; doctors handle medical review; viewers can only look.</w:t>
+        <w:t>Roles and permissions</w:t>
+      </w:r>
+    </w:p>
+    <w:p>
+      <w:r>
+        <w:t>There are three roles. Admins have full access; doctors handle medical review; viewers can only look.</w:t>
       </w:r>
     </w:p>
     <w:tbl>
@@ -91,7 +98,7 @@
         <w:tblStyle w:val="TableGrid"/>
         <w:tblW w:w="0" w:type="auto"/>
         <w:tblLayout w:type="fixed"/>
-        <w:tblLook w:val="04A0" w:firstRow="1" w:lastRow="0" w:firstColumn="0" w:lastColumn="0" w:noHBand="0" w:noVBand="1"/>
+        <w:tblLook w:val="0420" w:firstRow="1" w:lastRow="0" w:firstColumn="0" w:lastColumn="0" w:noHBand="0" w:noVBand="1"/>
       </w:tblPr>
       <w:tblGrid>
         <w:gridCol w:w="2340"/>
@@ -109,9 +116,18 @@
             <w:shd w:val="clear" w:color="auto" w:fill="F2F2F2"/>
           </w:tcPr>
           <w:p>
-            <w:pPr/>
-            <w:r>
-              <w:t xml:space="preserve">What they can do</w:t>
+            <w:pPr>
+              <w:rPr>
+                <w:b/>
+                <w:bCs/>
+              </w:rPr>
+            </w:pPr>
+            <w:r>
+              <w:rPr>
+                <w:b/>
+                <w:bCs/>
+              </w:rPr>
+              <w:t>What they can do</w:t>
             </w:r>
           </w:p>
         </w:tc>
@@ -121,9 +137,18 @@
             <w:shd w:val="clear" w:color="auto" w:fill="F2F2F2"/>
           </w:tcPr>
           <w:p>
-            <w:pPr/>
-            <w:r>
-              <w:t xml:space="preserve">Admin</w:t>
+            <w:pPr>
+              <w:rPr>
+                <w:b/>
+                <w:bCs/>
+              </w:rPr>
+            </w:pPr>
+            <w:r>
+              <w:rPr>
+                <w:b/>
+                <w:bCs/>
+              </w:rPr>
+              <w:t>Admin</w:t>
             </w:r>
           </w:p>
         </w:tc>
@@ -133,9 +158,18 @@
             <w:shd w:val="clear" w:color="auto" w:fill="F2F2F2"/>
           </w:tcPr>
           <w:p>
-            <w:pPr/>
-            <w:r>
-              <w:t xml:space="preserve">Doctor</w:t>
+            <w:pPr>
+              <w:rPr>
+                <w:b/>
+                <w:bCs/>
+              </w:rPr>
+            </w:pPr>
+            <w:r>
+              <w:rPr>
+                <w:b/>
+                <w:bCs/>
+              </w:rPr>
+              <w:t>Doctor</w:t>
             </w:r>
           </w:p>
         </w:tc>
@@ -145,9 +179,18 @@
             <w:shd w:val="clear" w:color="auto" w:fill="F2F2F2"/>
           </w:tcPr>
           <w:p>
-            <w:pPr/>
-            <w:r>
-              <w:t xml:space="preserve">Viewer</w:t>
+            <w:pPr>
+              <w:rPr>
+                <w:b/>
+                <w:bCs/>
+              </w:rPr>
+            </w:pPr>
+            <w:r>
+              <w:rPr>
+                <w:b/>
+                <w:bCs/>
+              </w:rPr>
+              <w:t>Viewer</w:t>
             </w:r>
           </w:p>
         </w:tc>
@@ -158,42 +201,38 @@
             <w:tcW w:w="2340" w:type="dxa"/>
           </w:tcPr>
           <w:p>
-            <w:pPr/>
-            <w:r>
-              <w:t xml:space="preserve">View the analytics dashboard</w:t>
-            </w:r>
-          </w:p>
-        </w:tc>
-        <w:tc>
-          <w:tcPr>
-            <w:tcW w:w="2340" w:type="dxa"/>
-          </w:tcPr>
-          <w:p>
-            <w:pPr/>
-            <w:r>
-              <w:t xml:space="preserve">✓</w:t>
-            </w:r>
-          </w:p>
-        </w:tc>
-        <w:tc>
-          <w:tcPr>
-            <w:tcW w:w="2340" w:type="dxa"/>
-          </w:tcPr>
-          <w:p>
-            <w:pPr/>
-            <w:r>
-              <w:t xml:space="preserve">✓</w:t>
-            </w:r>
-          </w:p>
-        </w:tc>
-        <w:tc>
-          <w:tcPr>
-            <w:tcW w:w="2340" w:type="dxa"/>
-          </w:tcPr>
-          <w:p>
-            <w:pPr/>
-            <w:r>
-              <w:t xml:space="preserve">✓</w:t>
+            <w:r>
+              <w:t>View the analytics dashboard</w:t>
+            </w:r>
+          </w:p>
+        </w:tc>
+        <w:tc>
+          <w:tcPr>
+            <w:tcW w:w="2340" w:type="dxa"/>
+          </w:tcPr>
+          <w:p>
+            <w:r>
+              <w:t>✓</w:t>
+            </w:r>
+          </w:p>
+        </w:tc>
+        <w:tc>
+          <w:tcPr>
+            <w:tcW w:w="2340" w:type="dxa"/>
+          </w:tcPr>
+          <w:p>
+            <w:r>
+              <w:t>✓</w:t>
+            </w:r>
+          </w:p>
+        </w:tc>
+        <w:tc>
+          <w:tcPr>
+            <w:tcW w:w="2340" w:type="dxa"/>
+          </w:tcPr>
+          <w:p>
+            <w:r>
+              <w:t>✓</w:t>
             </w:r>
           </w:p>
         </w:tc>
@@ -204,42 +243,38 @@
             <w:tcW w:w="2340" w:type="dxa"/>
           </w:tcPr>
           <w:p>
-            <w:pPr/>
-            <w:r>
-              <w:t xml:space="preserve">Read customer chats</w:t>
-            </w:r>
-          </w:p>
-        </w:tc>
-        <w:tc>
-          <w:tcPr>
-            <w:tcW w:w="2340" w:type="dxa"/>
-          </w:tcPr>
-          <w:p>
-            <w:pPr/>
-            <w:r>
-              <w:t xml:space="preserve">✓</w:t>
-            </w:r>
-          </w:p>
-        </w:tc>
-        <w:tc>
-          <w:tcPr>
-            <w:tcW w:w="2340" w:type="dxa"/>
-          </w:tcPr>
-          <w:p>
-            <w:pPr/>
-            <w:r>
-              <w:t xml:space="preserve">✓</w:t>
-            </w:r>
-          </w:p>
-        </w:tc>
-        <w:tc>
-          <w:tcPr>
-            <w:tcW w:w="2340" w:type="dxa"/>
-          </w:tcPr>
-          <w:p>
-            <w:pPr/>
-            <w:r>
-              <w:t xml:space="preserve">✓</w:t>
+            <w:r>
+              <w:t>Read customer chats</w:t>
+            </w:r>
+          </w:p>
+        </w:tc>
+        <w:tc>
+          <w:tcPr>
+            <w:tcW w:w="2340" w:type="dxa"/>
+          </w:tcPr>
+          <w:p>
+            <w:r>
+              <w:t>✓</w:t>
+            </w:r>
+          </w:p>
+        </w:tc>
+        <w:tc>
+          <w:tcPr>
+            <w:tcW w:w="2340" w:type="dxa"/>
+          </w:tcPr>
+          <w:p>
+            <w:r>
+              <w:t>✓</w:t>
+            </w:r>
+          </w:p>
+        </w:tc>
+        <w:tc>
+          <w:tcPr>
+            <w:tcW w:w="2340" w:type="dxa"/>
+          </w:tcPr>
+          <w:p>
+            <w:r>
+              <w:t>✓</w:t>
             </w:r>
           </w:p>
         </w:tc>
@@ -250,42 +285,38 @@
             <w:tcW w:w="2340" w:type="dxa"/>
           </w:tcPr>
           <w:p>
-            <w:pPr/>
-            <w:r>
-              <w:t xml:space="preserve">Join a live chat</w:t>
-            </w:r>
-          </w:p>
-        </w:tc>
-        <w:tc>
-          <w:tcPr>
-            <w:tcW w:w="2340" w:type="dxa"/>
-          </w:tcPr>
-          <w:p>
-            <w:pPr/>
-            <w:r>
-              <w:t xml:space="preserve">✓</w:t>
-            </w:r>
-          </w:p>
-        </w:tc>
-        <w:tc>
-          <w:tcPr>
-            <w:tcW w:w="2340" w:type="dxa"/>
-          </w:tcPr>
-          <w:p>
-            <w:pPr/>
-            <w:r>
-              <w:t xml:space="preserve">—</w:t>
-            </w:r>
-          </w:p>
-        </w:tc>
-        <w:tc>
-          <w:tcPr>
-            <w:tcW w:w="2340" w:type="dxa"/>
-          </w:tcPr>
-          <w:p>
-            <w:pPr/>
-            <w:r>
-              <w:t xml:space="preserve">—</w:t>
+            <w:r>
+              <w:t>Join a live chat</w:t>
+            </w:r>
+          </w:p>
+        </w:tc>
+        <w:tc>
+          <w:tcPr>
+            <w:tcW w:w="2340" w:type="dxa"/>
+          </w:tcPr>
+          <w:p>
+            <w:r>
+              <w:t>✓</w:t>
+            </w:r>
+          </w:p>
+        </w:tc>
+        <w:tc>
+          <w:tcPr>
+            <w:tcW w:w="2340" w:type="dxa"/>
+          </w:tcPr>
+          <w:p>
+            <w:r>
+              <w:t>—</w:t>
+            </w:r>
+          </w:p>
+        </w:tc>
+        <w:tc>
+          <w:tcPr>
+            <w:tcW w:w="2340" w:type="dxa"/>
+          </w:tcPr>
+          <w:p>
+            <w:r>
+              <w:t>—</w:t>
             </w:r>
           </w:p>
         </w:tc>
@@ -296,42 +327,38 @@
             <w:tcW w:w="2340" w:type="dxa"/>
           </w:tcPr>
           <w:p>
-            <w:pPr/>
-            <w:r>
-              <w:t xml:space="preserve">Tag a chat as "Needs doctor review"</w:t>
-            </w:r>
-          </w:p>
-        </w:tc>
-        <w:tc>
-          <w:tcPr>
-            <w:tcW w:w="2340" w:type="dxa"/>
-          </w:tcPr>
-          <w:p>
-            <w:pPr/>
-            <w:r>
-              <w:t xml:space="preserve">✓</w:t>
-            </w:r>
-          </w:p>
-        </w:tc>
-        <w:tc>
-          <w:tcPr>
-            <w:tcW w:w="2340" w:type="dxa"/>
-          </w:tcPr>
-          <w:p>
-            <w:pPr/>
-            <w:r>
-              <w:t xml:space="preserve">✓</w:t>
-            </w:r>
-          </w:p>
-        </w:tc>
-        <w:tc>
-          <w:tcPr>
-            <w:tcW w:w="2340" w:type="dxa"/>
-          </w:tcPr>
-          <w:p>
-            <w:pPr/>
-            <w:r>
-              <w:t xml:space="preserve">—</w:t>
+            <w:r>
+              <w:t>Tag a chat as "Needs doctor review"</w:t>
+            </w:r>
+          </w:p>
+        </w:tc>
+        <w:tc>
+          <w:tcPr>
+            <w:tcW w:w="2340" w:type="dxa"/>
+          </w:tcPr>
+          <w:p>
+            <w:r>
+              <w:t>✓</w:t>
+            </w:r>
+          </w:p>
+        </w:tc>
+        <w:tc>
+          <w:tcPr>
+            <w:tcW w:w="2340" w:type="dxa"/>
+          </w:tcPr>
+          <w:p>
+            <w:r>
+              <w:t>✓</w:t>
+            </w:r>
+          </w:p>
+        </w:tc>
+        <w:tc>
+          <w:tcPr>
+            <w:tcW w:w="2340" w:type="dxa"/>
+          </w:tcPr>
+          <w:p>
+            <w:r>
+              <w:t>—</w:t>
             </w:r>
           </w:p>
         </w:tc>
@@ -342,42 +369,38 @@
             <w:tcW w:w="2340" w:type="dxa"/>
           </w:tcPr>
           <w:p>
-            <w:pPr/>
-            <w:r>
-              <w:t xml:space="preserve">Review, approve or edit tagged answers</w:t>
-            </w:r>
-          </w:p>
-        </w:tc>
-        <w:tc>
-          <w:tcPr>
-            <w:tcW w:w="2340" w:type="dxa"/>
-          </w:tcPr>
-          <w:p>
-            <w:pPr/>
-            <w:r>
-              <w:t xml:space="preserve">✓</w:t>
-            </w:r>
-          </w:p>
-        </w:tc>
-        <w:tc>
-          <w:tcPr>
-            <w:tcW w:w="2340" w:type="dxa"/>
-          </w:tcPr>
-          <w:p>
-            <w:pPr/>
-            <w:r>
-              <w:t xml:space="preserve">✓</w:t>
-            </w:r>
-          </w:p>
-        </w:tc>
-        <w:tc>
-          <w:tcPr>
-            <w:tcW w:w="2340" w:type="dxa"/>
-          </w:tcPr>
-          <w:p>
-            <w:pPr/>
-            <w:r>
-              <w:t xml:space="preserve">—</w:t>
+            <w:r>
+              <w:t>Review, approve or edit tagged answers</w:t>
+            </w:r>
+          </w:p>
+        </w:tc>
+        <w:tc>
+          <w:tcPr>
+            <w:tcW w:w="2340" w:type="dxa"/>
+          </w:tcPr>
+          <w:p>
+            <w:r>
+              <w:t>✓</w:t>
+            </w:r>
+          </w:p>
+        </w:tc>
+        <w:tc>
+          <w:tcPr>
+            <w:tcW w:w="2340" w:type="dxa"/>
+          </w:tcPr>
+          <w:p>
+            <w:r>
+              <w:t>✓</w:t>
+            </w:r>
+          </w:p>
+        </w:tc>
+        <w:tc>
+          <w:tcPr>
+            <w:tcW w:w="2340" w:type="dxa"/>
+          </w:tcPr>
+          <w:p>
+            <w:r>
+              <w:t>—</w:t>
             </w:r>
           </w:p>
         </w:tc>
@@ -388,42 +411,38 @@
             <w:tcW w:w="2340" w:type="dxa"/>
           </w:tcPr>
           <w:p>
-            <w:pPr/>
-            <w:r>
-              <w:t xml:space="preserve">Edit FAQs, knowledge base and documents</w:t>
-            </w:r>
-          </w:p>
-        </w:tc>
-        <w:tc>
-          <w:tcPr>
-            <w:tcW w:w="2340" w:type="dxa"/>
-          </w:tcPr>
-          <w:p>
-            <w:pPr/>
-            <w:r>
-              <w:t xml:space="preserve">✓</w:t>
-            </w:r>
-          </w:p>
-        </w:tc>
-        <w:tc>
-          <w:tcPr>
-            <w:tcW w:w="2340" w:type="dxa"/>
-          </w:tcPr>
-          <w:p>
-            <w:pPr/>
-            <w:r>
-              <w:t xml:space="preserve">—</w:t>
-            </w:r>
-          </w:p>
-        </w:tc>
-        <w:tc>
-          <w:tcPr>
-            <w:tcW w:w="2340" w:type="dxa"/>
-          </w:tcPr>
-          <w:p>
-            <w:pPr/>
-            <w:r>
-              <w:t xml:space="preserve">—</w:t>
+            <w:r>
+              <w:t>Edit FAQs, knowledge base and documents</w:t>
+            </w:r>
+          </w:p>
+        </w:tc>
+        <w:tc>
+          <w:tcPr>
+            <w:tcW w:w="2340" w:type="dxa"/>
+          </w:tcPr>
+          <w:p>
+            <w:r>
+              <w:t>✓</w:t>
+            </w:r>
+          </w:p>
+        </w:tc>
+        <w:tc>
+          <w:tcPr>
+            <w:tcW w:w="2340" w:type="dxa"/>
+          </w:tcPr>
+          <w:p>
+            <w:r>
+              <w:t>—</w:t>
+            </w:r>
+          </w:p>
+        </w:tc>
+        <w:tc>
+          <w:tcPr>
+            <w:tcW w:w="2340" w:type="dxa"/>
+          </w:tcPr>
+          <w:p>
+            <w:r>
+              <w:t>—</w:t>
             </w:r>
           </w:p>
         </w:tc>
@@ -434,42 +453,38 @@
             <w:tcW w:w="2340" w:type="dxa"/>
           </w:tcPr>
           <w:p>
-            <w:pPr/>
-            <w:r>
-              <w:t xml:space="preserve">Create and edit offers</w:t>
-            </w:r>
-          </w:p>
-        </w:tc>
-        <w:tc>
-          <w:tcPr>
-            <w:tcW w:w="2340" w:type="dxa"/>
-          </w:tcPr>
-          <w:p>
-            <w:pPr/>
-            <w:r>
-              <w:t xml:space="preserve">✓</w:t>
-            </w:r>
-          </w:p>
-        </w:tc>
-        <w:tc>
-          <w:tcPr>
-            <w:tcW w:w="2340" w:type="dxa"/>
-          </w:tcPr>
-          <w:p>
-            <w:pPr/>
-            <w:r>
-              <w:t xml:space="preserve">—</w:t>
-            </w:r>
-          </w:p>
-        </w:tc>
-        <w:tc>
-          <w:tcPr>
-            <w:tcW w:w="2340" w:type="dxa"/>
-          </w:tcPr>
-          <w:p>
-            <w:pPr/>
-            <w:r>
-              <w:t xml:space="preserve">—</w:t>
+            <w:r>
+              <w:t>Create and edit offers</w:t>
+            </w:r>
+          </w:p>
+        </w:tc>
+        <w:tc>
+          <w:tcPr>
+            <w:tcW w:w="2340" w:type="dxa"/>
+          </w:tcPr>
+          <w:p>
+            <w:r>
+              <w:t>✓</w:t>
+            </w:r>
+          </w:p>
+        </w:tc>
+        <w:tc>
+          <w:tcPr>
+            <w:tcW w:w="2340" w:type="dxa"/>
+          </w:tcPr>
+          <w:p>
+            <w:r>
+              <w:t>—</w:t>
+            </w:r>
+          </w:p>
+        </w:tc>
+        <w:tc>
+          <w:tcPr>
+            <w:tcW w:w="2340" w:type="dxa"/>
+          </w:tcPr>
+          <w:p>
+            <w:r>
+              <w:t>—</w:t>
             </w:r>
           </w:p>
         </w:tc>
@@ -480,42 +495,38 @@
             <w:tcW w:w="2340" w:type="dxa"/>
           </w:tcPr>
           <w:p>
-            <w:pPr/>
-            <w:r>
-              <w:t xml:space="preserve">Use the test chat and push changes live</w:t>
-            </w:r>
-          </w:p>
-        </w:tc>
-        <w:tc>
-          <w:tcPr>
-            <w:tcW w:w="2340" w:type="dxa"/>
-          </w:tcPr>
-          <w:p>
-            <w:pPr/>
-            <w:r>
-              <w:t xml:space="preserve">✓</w:t>
-            </w:r>
-          </w:p>
-        </w:tc>
-        <w:tc>
-          <w:tcPr>
-            <w:tcW w:w="2340" w:type="dxa"/>
-          </w:tcPr>
-          <w:p>
-            <w:pPr/>
-            <w:r>
-              <w:t xml:space="preserve">—</w:t>
-            </w:r>
-          </w:p>
-        </w:tc>
-        <w:tc>
-          <w:tcPr>
-            <w:tcW w:w="2340" w:type="dxa"/>
-          </w:tcPr>
-          <w:p>
-            <w:pPr/>
-            <w:r>
-              <w:t xml:space="preserve">—</w:t>
+            <w:r>
+              <w:t>Use the test chat and push changes live</w:t>
+            </w:r>
+          </w:p>
+        </w:tc>
+        <w:tc>
+          <w:tcPr>
+            <w:tcW w:w="2340" w:type="dxa"/>
+          </w:tcPr>
+          <w:p>
+            <w:r>
+              <w:t>✓</w:t>
+            </w:r>
+          </w:p>
+        </w:tc>
+        <w:tc>
+          <w:tcPr>
+            <w:tcW w:w="2340" w:type="dxa"/>
+          </w:tcPr>
+          <w:p>
+            <w:r>
+              <w:t>—</w:t>
+            </w:r>
+          </w:p>
+        </w:tc>
+        <w:tc>
+          <w:tcPr>
+            <w:tcW w:w="2340" w:type="dxa"/>
+          </w:tcPr>
+          <w:p>
+            <w:r>
+              <w:t>—</w:t>
             </w:r>
           </w:p>
         </w:tc>
@@ -526,42 +537,38 @@
             <w:tcW w:w="2340" w:type="dxa"/>
           </w:tcPr>
           <w:p>
-            <w:pPr/>
-            <w:r>
-              <w:t xml:space="preserve">View the change log</w:t>
-            </w:r>
-          </w:p>
-        </w:tc>
-        <w:tc>
-          <w:tcPr>
-            <w:tcW w:w="2340" w:type="dxa"/>
-          </w:tcPr>
-          <w:p>
-            <w:pPr/>
-            <w:r>
-              <w:t xml:space="preserve">✓</w:t>
-            </w:r>
-          </w:p>
-        </w:tc>
-        <w:tc>
-          <w:tcPr>
-            <w:tcW w:w="2340" w:type="dxa"/>
-          </w:tcPr>
-          <w:p>
-            <w:pPr/>
-            <w:r>
-              <w:t xml:space="preserve">—</w:t>
-            </w:r>
-          </w:p>
-        </w:tc>
-        <w:tc>
-          <w:tcPr>
-            <w:tcW w:w="2340" w:type="dxa"/>
-          </w:tcPr>
-          <w:p>
-            <w:pPr/>
-            <w:r>
-              <w:t xml:space="preserve">—</w:t>
+            <w:r>
+              <w:t>View the change log</w:t>
+            </w:r>
+          </w:p>
+        </w:tc>
+        <w:tc>
+          <w:tcPr>
+            <w:tcW w:w="2340" w:type="dxa"/>
+          </w:tcPr>
+          <w:p>
+            <w:r>
+              <w:t>✓</w:t>
+            </w:r>
+          </w:p>
+        </w:tc>
+        <w:tc>
+          <w:tcPr>
+            <w:tcW w:w="2340" w:type="dxa"/>
+          </w:tcPr>
+          <w:p>
+            <w:r>
+              <w:t>—</w:t>
+            </w:r>
+          </w:p>
+        </w:tc>
+        <w:tc>
+          <w:tcPr>
+            <w:tcW w:w="2340" w:type="dxa"/>
+          </w:tcPr>
+          <w:p>
+            <w:r>
+              <w:t>—</w:t>
             </w:r>
           </w:p>
         </w:tc>
@@ -572,42 +579,38 @@
             <w:tcW w:w="2340" w:type="dxa"/>
           </w:tcPr>
           <w:p>
-            <w:pPr/>
-            <w:r>
-              <w:t xml:space="preserve">Add users and assign roles</w:t>
-            </w:r>
-          </w:p>
-        </w:tc>
-        <w:tc>
-          <w:tcPr>
-            <w:tcW w:w="2340" w:type="dxa"/>
-          </w:tcPr>
-          <w:p>
-            <w:pPr/>
-            <w:r>
-              <w:t xml:space="preserve">✓</w:t>
-            </w:r>
-          </w:p>
-        </w:tc>
-        <w:tc>
-          <w:tcPr>
-            <w:tcW w:w="2340" w:type="dxa"/>
-          </w:tcPr>
-          <w:p>
-            <w:pPr/>
-            <w:r>
-              <w:t xml:space="preserve">—</w:t>
-            </w:r>
-          </w:p>
-        </w:tc>
-        <w:tc>
-          <w:tcPr>
-            <w:tcW w:w="2340" w:type="dxa"/>
-          </w:tcPr>
-          <w:p>
-            <w:pPr/>
-            <w:r>
-              <w:t xml:space="preserve">—</w:t>
+            <w:r>
+              <w:t>Add users and assign roles</w:t>
+            </w:r>
+          </w:p>
+        </w:tc>
+        <w:tc>
+          <w:tcPr>
+            <w:tcW w:w="2340" w:type="dxa"/>
+          </w:tcPr>
+          <w:p>
+            <w:r>
+              <w:t>✓</w:t>
+            </w:r>
+          </w:p>
+        </w:tc>
+        <w:tc>
+          <w:tcPr>
+            <w:tcW w:w="2340" w:type="dxa"/>
+          </w:tcPr>
+          <w:p>
+            <w:r>
+              <w:t>—</w:t>
+            </w:r>
+          </w:p>
+        </w:tc>
+        <w:tc>
+          <w:tcPr>
+            <w:tcW w:w="2340" w:type="dxa"/>
+          </w:tcPr>
+          <w:p>
+            <w:r>
+              <w:t>—</w:t>
             </w:r>
           </w:p>
         </w:tc>
@@ -618,7 +621,8 @@
         <w:pStyle w:val="Heading2"/>
       </w:pPr>
       <w:r>
-        <w:t xml:space="preserve">Admin Panel</w:t>
+        <w:lastRenderedPageBreak/>
+        <w:t>Admin Panel</w:t>
       </w:r>
     </w:p>
     <w:p>
@@ -626,16 +630,15 @@
         <w:pStyle w:val="Heading3"/>
       </w:pPr>
       <w:r>
-        <w:t xml:space="preserve">1. Knowledge base and FAQs</w:t>
-      </w:r>
-    </w:p>
-    <w:p>
-      <w:pPr/>
+        <w:t>1. Knowledge base and FAQs</w:t>
+      </w:r>
+    </w:p>
+    <w:p>
       <w:r>
         <w:rPr>
           <w:i/>
         </w:rPr>
-        <w:t xml:space="preserve">As an admin, I want to update what the chatbot knows, so customers always get current, correct answers.</w:t>
+        <w:t>As an admin, I want to update what the chatbot knows, so customers always get current, correct answers.</w:t>
       </w:r>
     </w:p>
     <w:p>
@@ -650,7 +653,7 @@
         <w:rPr>
           <w:b/>
         </w:rPr>
-        <w:t xml:space="preserve">Edit FAQs:</w:t>
+        <w:t>Edit FAQs:</w:t>
       </w:r>
       <w:r>
         <w:t xml:space="preserve"> add, edit or remove any question and answer. For example, update the acne treatment guarantee when its terms change.</w:t>
@@ -668,7 +671,7 @@
         <w:rPr>
           <w:b/>
         </w:rPr>
-        <w:t xml:space="preserve">Add new content:</w:t>
+        <w:t>Add new content:</w:t>
       </w:r>
       <w:r>
         <w:t xml:space="preserve"> add new topics to the knowledge base, such as a new product, ingredient or treatment explanation.</w:t>
@@ -686,7 +689,7 @@
         <w:rPr>
           <w:b/>
         </w:rPr>
-        <w:t xml:space="preserve">Upload documents:</w:t>
+        <w:t>Upload documents:</w:t>
       </w:r>
       <w:r>
         <w:t xml:space="preserve"> upload files such as product sheets, usage guides or policies. The chatbot can answer from them.</w:t>
@@ -700,11 +703,19 @@
           <w:numId w:val="3"/>
         </w:numPr>
       </w:pPr>
-      <w:r>
-        <w:rPr>
-          <w:b/>
-        </w:rPr>
-        <w:t xml:space="preserve">Organise:</w:t>
+      <w:proofErr w:type="spellStart"/>
+      <w:r>
+        <w:rPr>
+          <w:b/>
+        </w:rPr>
+        <w:t>Organise</w:t>
+      </w:r>
+      <w:proofErr w:type="spellEnd"/>
+      <w:r>
+        <w:rPr>
+          <w:b/>
+        </w:rPr>
+        <w:t>:</w:t>
       </w:r>
       <w:r>
         <w:t xml:space="preserve"> each entry has a category (for example: Products, Treatment, Guarantee, Delivery, Payments) and can be searched.</w:t>
@@ -722,7 +733,7 @@
         <w:rPr>
           <w:b/>
         </w:rPr>
-        <w:t xml:space="preserve">Draft first:</w:t>
+        <w:t>Draft first:</w:t>
       </w:r>
       <w:r>
         <w:t xml:space="preserve"> every new or edited entry is saved as a draft. It only reaches customers after it is tested and pushed live (see section 3).</w:t>
@@ -733,16 +744,15 @@
         <w:pStyle w:val="Heading3"/>
       </w:pPr>
       <w:r>
-        <w:t xml:space="preserve">2. Offers</w:t>
-      </w:r>
-    </w:p>
-    <w:p>
-      <w:pPr/>
+        <w:t>2. Offers</w:t>
+      </w:r>
+    </w:p>
+    <w:p>
       <w:r>
         <w:rPr>
           <w:i/>
         </w:rPr>
-        <w:t xml:space="preserve">As an admin, I want to set different offers for different parts of the month, so the chatbot always shows customers the right discount.</w:t>
+        <w:t>As an admin, I want to set different offers for different parts of the month, so the chatbot always shows customers the right discount.</w:t>
       </w:r>
     </w:p>
     <w:p>
@@ -757,7 +767,7 @@
         <w:rPr>
           <w:b/>
         </w:rPr>
-        <w:t xml:space="preserve">Create an offer</w:t>
+        <w:t>Create an offer</w:t>
       </w:r>
       <w:r>
         <w:t xml:space="preserve"> with: offer name, discount code, discount amount or percentage, which products or kits it applies to, and any conditions (for example, minimum order value or first order only).</w:t>
@@ -775,7 +785,7 @@
         <w:rPr>
           <w:b/>
         </w:rPr>
-        <w:t xml:space="preserve">Schedule it:</w:t>
+        <w:t>Schedule it:</w:t>
       </w:r>
       <w:r>
         <w:t xml:space="preserve"> set a start and end date for each offer. For example, a mid-month offer from the 10th to the 20th, and a month-end offer from the 25th to the last day.</w:t>
@@ -793,7 +803,7 @@
         <w:rPr>
           <w:b/>
         </w:rPr>
-        <w:t xml:space="preserve">Automatic switching:</w:t>
+        <w:t>Automatic switching:</w:t>
       </w:r>
       <w:r>
         <w:t xml:space="preserve"> the chatbot shows an offer only while it is active, and stops on its end date with no manual step.</w:t>
@@ -811,7 +821,7 @@
         <w:rPr>
           <w:b/>
         </w:rPr>
-        <w:t xml:space="preserve">Pause or edit</w:t>
+        <w:t>Pause or edit</w:t>
       </w:r>
       <w:r>
         <w:t xml:space="preserve"> any offer at any time.</w:t>
@@ -829,7 +839,7 @@
         <w:rPr>
           <w:b/>
         </w:rPr>
-        <w:t xml:space="preserve">Offer list</w:t>
+        <w:t>Offer list</w:t>
       </w:r>
       <w:r>
         <w:t xml:space="preserve"> shows each offer's status: Scheduled, Active, Paused or Expired.</w:t>
@@ -844,7 +854,7 @@
         </w:numPr>
       </w:pPr>
       <w:r>
-        <w:t xml:space="preserve">The chatbot only mentions offers listed here. It never makes up a discount.</w:t>
+        <w:t>The chatbot only mentions offers listed here. It never makes up a discount.</w:t>
       </w:r>
     </w:p>
     <w:p>
@@ -852,16 +862,15 @@
         <w:pStyle w:val="Heading3"/>
       </w:pPr>
       <w:r>
-        <w:t xml:space="preserve">3. Test chat and push to live</w:t>
-      </w:r>
-    </w:p>
-    <w:p>
-      <w:pPr/>
+        <w:t>3. Test chat and push to live</w:t>
+      </w:r>
+    </w:p>
+    <w:p>
       <w:r>
         <w:rPr>
           <w:i/>
         </w:rPr>
-        <w:t xml:space="preserve">As an admin, I want to try my changes in a test chat before customers see them, so nothing wrong goes live.</w:t>
+        <w:t>As an admin, I want to try my changes in a test chat before customers see them, so nothing wrong goes live.</w:t>
       </w:r>
     </w:p>
     <w:p>
@@ -876,7 +885,7 @@
         <w:rPr>
           <w:b/>
         </w:rPr>
-        <w:t xml:space="preserve">Test chat:</w:t>
+        <w:t>Test chat:</w:t>
       </w:r>
       <w:r>
         <w:t xml:space="preserve"> a chat window inside the admin panel that uses the draft content and offers, not the live ones.</w:t>
@@ -891,7 +900,7 @@
         </w:numPr>
       </w:pPr>
       <w:r>
-        <w:t xml:space="preserve">The admin asks questions in the test chat and checks the answers. They can keep editing and re-testing as many times as needed.</w:t>
+        <w:t>The admin asks questions in the test chat and checks the answers. They can keep editing and re-testing as many times as needed.</w:t>
       </w:r>
     </w:p>
     <w:p>
@@ -906,7 +915,7 @@
         <w:rPr>
           <w:b/>
         </w:rPr>
-        <w:t xml:space="preserve">Push to live:</w:t>
+        <w:t>Push to live:</w:t>
       </w:r>
       <w:r>
         <w:t xml:space="preserve"> once happy, the admin clicks "Push to live". Only then do customers get the updated content.</w:t>
@@ -924,7 +933,7 @@
         <w:rPr>
           <w:b/>
         </w:rPr>
-        <w:t xml:space="preserve">What's changing:</w:t>
+        <w:t>What's changing:</w:t>
       </w:r>
       <w:r>
         <w:t xml:space="preserve"> before pushing, the panel shows a summary of all drafts that will go live.</w:t>
@@ -942,7 +951,7 @@
         <w:rPr>
           <w:b/>
         </w:rPr>
-        <w:t xml:space="preserve">Undo:</w:t>
+        <w:t>Undo:</w:t>
       </w:r>
       <w:r>
         <w:t xml:space="preserve"> if something goes wrong after pushing, the admin can restore the previous live version.</w:t>
@@ -953,16 +962,16 @@
         <w:pStyle w:val="Heading3"/>
       </w:pPr>
       <w:r>
-        <w:t xml:space="preserve">4. Customer chats</w:t>
-      </w:r>
-    </w:p>
-    <w:p>
-      <w:pPr/>
+        <w:lastRenderedPageBreak/>
+        <w:t>4. Customer chats</w:t>
+      </w:r>
+    </w:p>
+    <w:p>
       <w:r>
         <w:rPr>
           <w:i/>
         </w:rPr>
-        <w:t xml:space="preserve">As an admin, I want to read real customer chats and step in when needed, so no customer gets a wrong or unhelpful answer.</w:t>
+        <w:t>As an admin, I want to read real customer chats and step in when needed, so no customer gets a wrong or unhelpful answer.</w:t>
       </w:r>
     </w:p>
     <w:p>
@@ -977,7 +986,7 @@
         <w:rPr>
           <w:b/>
         </w:rPr>
-        <w:t xml:space="preserve">Chat list:</w:t>
+        <w:t>Chat list:</w:t>
       </w:r>
       <w:r>
         <w:t xml:space="preserve"> all customer chats, newest first, with ongoing chats marked "Live".</w:t>
@@ -995,7 +1004,7 @@
         <w:rPr>
           <w:b/>
         </w:rPr>
-        <w:t xml:space="preserve">Read any chat:</w:t>
+        <w:t>Read any chat:</w:t>
       </w:r>
       <w:r>
         <w:t xml:space="preserve"> open the full conversation, including the customer's name and phone number if shared.</w:t>
@@ -1013,7 +1022,7 @@
         <w:rPr>
           <w:b/>
         </w:rPr>
-        <w:t xml:space="preserve">Search and filter:</w:t>
+        <w:t>Search and filter:</w:t>
       </w:r>
       <w:r>
         <w:t xml:space="preserve"> by date, live or ended, tagged for doctor review, and whether the customer placed an order.</w:t>
@@ -1031,7 +1040,7 @@
         <w:rPr>
           <w:b/>
         </w:rPr>
-        <w:t xml:space="preserve">Join a live chat:</w:t>
+        <w:t>Join a live chat:</w:t>
       </w:r>
       <w:r>
         <w:t xml:space="preserve"> the admin clicks "Take over" on a live chat. The chatbot stops replying and the admin types to the customer directly.</w:t>
@@ -1049,7 +1058,7 @@
         <w:rPr>
           <w:b/>
         </w:rPr>
-        <w:t xml:space="preserve">Hand back:</w:t>
+        <w:t>Hand back:</w:t>
       </w:r>
       <w:r>
         <w:t xml:space="preserve"> the admin can hand the chat back to the chatbot when done.</w:t>
@@ -1064,7 +1073,7 @@
         </w:numPr>
       </w:pPr>
       <w:r>
-        <w:t xml:space="preserve">The chat history shows which replies came from the chatbot and which from a team member.</w:t>
+        <w:t>The chat history shows which replies came from the chatbot and which from a team member.</w:t>
       </w:r>
     </w:p>
     <w:p>
@@ -1072,25 +1081,23 @@
         <w:pStyle w:val="Heading3"/>
       </w:pPr>
       <w:r>
-        <w:t xml:space="preserve">5. Doctor review</w:t>
-      </w:r>
-    </w:p>
-    <w:p>
-      <w:pPr/>
+        <w:t>5. Doctor review</w:t>
+      </w:r>
+    </w:p>
+    <w:p>
       <w:r>
         <w:rPr>
           <w:i/>
         </w:rPr>
-        <w:t xml:space="preserve">As an admin, I want to send doubtful medical answers to a doctor. As a doctor, I want to check them and correct anything wrong, so the chatbot only gives correct medical information.</w:t>
-      </w:r>
-    </w:p>
-    <w:p>
-      <w:pPr/>
-      <w:r>
-        <w:rPr>
-          <w:b/>
-        </w:rPr>
-        <w:t xml:space="preserve">How it works</w:t>
+        <w:t>As an admin, I want to send doubtful medical answers to a doctor. As a doctor, I want to check them and correct anything wrong, so the chatbot only gives correct medical information.</w:t>
+      </w:r>
+    </w:p>
+    <w:p>
+      <w:r>
+        <w:rPr>
+          <w:b/>
+        </w:rPr>
+        <w:t>How it works</w:t>
       </w:r>
     </w:p>
     <w:p>
@@ -1108,10 +1115,10 @@
         <w:rPr>
           <w:b/>
         </w:rPr>
-        <w:t xml:space="preserve">"Needs doctor review"</w:t>
-      </w:r>
-      <w:r>
-        <w:t xml:space="preserve">, with an optional note on what looks wrong.</w:t>
+        <w:t>"Needs doctor review"</w:t>
+      </w:r>
+      <w:r>
+        <w:t>, with an optional note on what looks wrong.</w:t>
       </w:r>
     </w:p>
     <w:p>
@@ -1129,7 +1136,7 @@
         <w:rPr>
           <w:b/>
         </w:rPr>
-        <w:t xml:space="preserve">Doctor Review</w:t>
+        <w:t>Doctor Review</w:t>
       </w:r>
       <w:r>
         <w:t xml:space="preserve"> tab, showing the customer's question, the chatbot's answer, the note and a link to the full chat.</w:t>
@@ -1144,7 +1151,7 @@
         </w:numPr>
       </w:pPr>
       <w:r>
-        <w:t xml:space="preserve">The doctor chooses one of two actions:</w:t>
+        <w:t>The doctor chooses one of two actions:</w:t>
       </w:r>
     </w:p>
     <w:p>
@@ -1159,7 +1166,7 @@
         <w:rPr>
           <w:b/>
         </w:rPr>
-        <w:t xml:space="preserve">Approve:</w:t>
+        <w:t>Approve:</w:t>
       </w:r>
       <w:r>
         <w:t xml:space="preserve"> the answer is correct. It is marked as doctor-approved.</w:t>
@@ -1177,7 +1184,7 @@
         <w:rPr>
           <w:b/>
         </w:rPr>
-        <w:t xml:space="preserve">Edit:</w:t>
+        <w:t>Edit:</w:t>
       </w:r>
       <w:r>
         <w:t xml:space="preserve"> the answer is wrong or incomplete. The doctor writes the corrected answer.</w:t>
@@ -1192,16 +1199,15 @@
         </w:numPr>
       </w:pPr>
       <w:r>
-        <w:t xml:space="preserve">A corrected answer updates the knowledge base, so the chatbot gives the corrected answer from then on.</w:t>
-      </w:r>
-    </w:p>
-    <w:p>
-      <w:pPr/>
-      <w:r>
-        <w:rPr>
-          <w:b/>
-        </w:rPr>
-        <w:t xml:space="preserve">Doctor Review tab</w:t>
+        <w:t>A corrected answer updates the knowledge base, so the chatbot gives the corrected answer from then on.</w:t>
+      </w:r>
+    </w:p>
+    <w:p>
+      <w:r>
+        <w:rPr>
+          <w:b/>
+        </w:rPr>
+        <w:t>Doctor Review tab</w:t>
       </w:r>
     </w:p>
     <w:p>
@@ -1213,7 +1219,7 @@
         </w:numPr>
       </w:pPr>
       <w:r>
-        <w:t xml:space="preserve">Shows items as Pending, Approved or Edited.</w:t>
+        <w:t>Shows items as Pending, Approved or Edited.</w:t>
       </w:r>
     </w:p>
     <w:p>
@@ -1225,7 +1231,7 @@
         </w:numPr>
       </w:pPr>
       <w:r>
-        <w:t xml:space="preserve">Shows who tagged each item, when, and which doctor reviewed it.</w:t>
+        <w:t>Shows who tagged each item, when, and which doctor reviewed it.</w:t>
       </w:r>
     </w:p>
     <w:p>
@@ -1237,7 +1243,7 @@
         </w:numPr>
       </w:pPr>
       <w:r>
-        <w:t xml:space="preserve">A count of pending items is visible on the doctor's home screen.</w:t>
+        <w:t>A count of pending items is visible on the doctor's home screen.</w:t>
       </w:r>
     </w:p>
     <w:p>
@@ -1245,16 +1251,15 @@
         <w:pStyle w:val="Heading3"/>
       </w:pPr>
       <w:r>
-        <w:t xml:space="preserve">6. Change log</w:t>
-      </w:r>
-    </w:p>
-    <w:p>
-      <w:pPr/>
+        <w:t>6. Change log</w:t>
+      </w:r>
+    </w:p>
+    <w:p>
       <w:r>
         <w:rPr>
           <w:i/>
         </w:rPr>
-        <w:t xml:space="preserve">As an admin, I want to see every change made in the panel, so I always know who changed what and when.</w:t>
+        <w:t>As an admin, I want to see every change made in the panel, so I always know who changed what and when.</w:t>
       </w:r>
     </w:p>
     <w:p>
@@ -1266,7 +1271,7 @@
         </w:numPr>
       </w:pPr>
       <w:r>
-        <w:t xml:space="preserve">Every change is recorded: FAQ and knowledge base edits, document uploads, offer changes, doctor approvals and edits, pushes to live, and role changes.</w:t>
+        <w:t>Every change is recorded: FAQ and knowledge base edits, document uploads, offer changes, doctor approvals and edits, pushes to live, and role changes.</w:t>
       </w:r>
     </w:p>
     <w:p>
@@ -1278,7 +1283,7 @@
         </w:numPr>
       </w:pPr>
       <w:r>
-        <w:t xml:space="preserve">Each record shows: what changed, the old and new content side by side, who made the change, and the date and time.</w:t>
+        <w:t>Each record shows: what changed, the old and new content side by side, who made the change, and the date and time.</w:t>
       </w:r>
     </w:p>
     <w:p>
@@ -1290,7 +1295,7 @@
         </w:numPr>
       </w:pPr>
       <w:r>
-        <w:t xml:space="preserve">Filter by date, person and type of change.</w:t>
+        <w:t>Filter by date, person and type of change.</w:t>
       </w:r>
     </w:p>
     <w:p>
@@ -1298,7 +1303,8 @@
         <w:pStyle w:val="Heading2"/>
       </w:pPr>
       <w:r>
-        <w:t xml:space="preserve">Analytics Dashboard</w:t>
+        <w:lastRenderedPageBreak/>
+        <w:t>Analytics Dashboard</w:t>
       </w:r>
     </w:p>
     <w:p>
@@ -1306,22 +1312,20 @@
         <w:pStyle w:val="Heading3"/>
       </w:pPr>
       <w:r>
-        <w:t xml:space="preserve">1. Chatbot funnel</w:t>
-      </w:r>
-    </w:p>
-    <w:p>
-      <w:pPr/>
+        <w:t>1. Chatbot funnel</w:t>
+      </w:r>
+    </w:p>
+    <w:p>
       <w:r>
         <w:rPr>
           <w:i/>
         </w:rPr>
-        <w:t xml:space="preserve">As an admin, I want to see how visitors move through the chatbot to an order, and where they drop off.</w:t>
-      </w:r>
-    </w:p>
-    <w:p>
-      <w:pPr/>
-      <w:r>
-        <w:t xml:space="preserve">The funnel shows six stages, each with its count and the drop-off percentage from the stage before it.</w:t>
+        <w:t>As an admin, I want to see how visitors move through the chatbot to an order, and where they drop off.</w:t>
+      </w:r>
+    </w:p>
+    <w:p>
+      <w:r>
+        <w:t>The funnel shows six stages, each with its count and the drop-off percentage from the stage before it.</w:t>
       </w:r>
     </w:p>
     <w:tbl>
@@ -1329,7 +1333,7 @@
         <w:tblStyle w:val="TableGrid"/>
         <w:tblW w:w="0" w:type="auto"/>
         <w:tblLayout w:type="fixed"/>
-        <w:tblLook w:val="04A0" w:firstRow="1" w:lastRow="0" w:firstColumn="0" w:lastColumn="0" w:noHBand="0" w:noVBand="1"/>
+        <w:tblLook w:val="0420" w:firstRow="1" w:lastRow="0" w:firstColumn="0" w:lastColumn="0" w:noHBand="0" w:noVBand="1"/>
       </w:tblPr>
       <w:tblGrid>
         <w:gridCol w:w="4680"/>
@@ -1345,9 +1349,8 @@
             <w:shd w:val="clear" w:color="auto" w:fill="F2F2F2"/>
           </w:tcPr>
           <w:p>
-            <w:pPr/>
-            <w:r>
-              <w:t xml:space="preserve">Stage</w:t>
+            <w:r>
+              <w:t>Stage</w:t>
             </w:r>
           </w:p>
         </w:tc>
@@ -1357,9 +1360,8 @@
             <w:shd w:val="clear" w:color="auto" w:fill="F2F2F2"/>
           </w:tcPr>
           <w:p>
-            <w:pPr/>
-            <w:r>
-              <w:t xml:space="preserve">Counts a visitor when they…</w:t>
+            <w:r>
+              <w:t>Counts a visitor when they…</w:t>
             </w:r>
           </w:p>
         </w:tc>
@@ -1370,9 +1372,8 @@
             <w:tcW w:w="4680" w:type="dxa"/>
           </w:tcPr>
           <w:p>
-            <w:pPr/>
-            <w:r>
-              <w:t xml:space="preserve">Visitors</w:t>
+            <w:r>
+              <w:t>Visitors</w:t>
             </w:r>
           </w:p>
         </w:tc>
@@ -1381,9 +1382,8 @@
             <w:tcW w:w="4680" w:type="dxa"/>
           </w:tcPr>
           <w:p>
-            <w:pPr/>
-            <w:r>
-              <w:t xml:space="preserve">Arrived on the website</w:t>
+            <w:r>
+              <w:t>Arrived on the website</w:t>
             </w:r>
           </w:p>
         </w:tc>
@@ -1394,9 +1394,8 @@
             <w:tcW w:w="4680" w:type="dxa"/>
           </w:tcPr>
           <w:p>
-            <w:pPr/>
-            <w:r>
-              <w:t xml:space="preserve">Opened chat</w:t>
+            <w:r>
+              <w:t>Opened chat</w:t>
             </w:r>
           </w:p>
         </w:tc>
@@ -1405,9 +1404,8 @@
             <w:tcW w:w="4680" w:type="dxa"/>
           </w:tcPr>
           <w:p>
-            <w:pPr/>
-            <w:r>
-              <w:t xml:space="preserve">Opened the chatbot window</w:t>
+            <w:r>
+              <w:t>Opened the chatbot window</w:t>
             </w:r>
           </w:p>
         </w:tc>
@@ -1418,9 +1416,8 @@
             <w:tcW w:w="4680" w:type="dxa"/>
           </w:tcPr>
           <w:p>
-            <w:pPr/>
-            <w:r>
-              <w:t xml:space="preserve">Started chat</w:t>
+            <w:r>
+              <w:t>Started chat</w:t>
             </w:r>
           </w:p>
         </w:tc>
@@ -1429,9 +1426,8 @@
             <w:tcW w:w="4680" w:type="dxa"/>
           </w:tcPr>
           <w:p>
-            <w:pPr/>
-            <w:r>
-              <w:t xml:space="preserve">Sent at least one message</w:t>
+            <w:r>
+              <w:t>Sent at least one message</w:t>
             </w:r>
           </w:p>
         </w:tc>
@@ -1442,9 +1438,8 @@
             <w:tcW w:w="4680" w:type="dxa"/>
           </w:tcPr>
           <w:p>
-            <w:pPr/>
-            <w:r>
-              <w:t xml:space="preserve">Engaged</w:t>
+            <w:r>
+              <w:t>Engaged</w:t>
             </w:r>
           </w:p>
         </w:tc>
@@ -1453,9 +1448,8 @@
             <w:tcW w:w="4680" w:type="dxa"/>
           </w:tcPr>
           <w:p>
-            <w:pPr/>
-            <w:r>
-              <w:t xml:space="preserve">Shared their phone number in the chat</w:t>
+            <w:r>
+              <w:t>Shared their phone number in the chat</w:t>
             </w:r>
           </w:p>
         </w:tc>
@@ -1466,9 +1460,8 @@
             <w:tcW w:w="4680" w:type="dxa"/>
           </w:tcPr>
           <w:p>
-            <w:pPr/>
-            <w:r>
-              <w:t xml:space="preserve">Added to cart</w:t>
+            <w:r>
+              <w:t>Added to cart</w:t>
             </w:r>
           </w:p>
         </w:tc>
@@ -1477,9 +1470,8 @@
             <w:tcW w:w="4680" w:type="dxa"/>
           </w:tcPr>
           <w:p>
-            <w:pPr/>
-            <w:r>
-              <w:t xml:space="preserve">Added a product to the cart after chatting</w:t>
+            <w:r>
+              <w:t>Added a product to the cart after chatting</w:t>
             </w:r>
           </w:p>
         </w:tc>
@@ -1490,9 +1482,8 @@
             <w:tcW w:w="4680" w:type="dxa"/>
           </w:tcPr>
           <w:p>
-            <w:pPr/>
-            <w:r>
-              <w:t xml:space="preserve">Converted</w:t>
+            <w:r>
+              <w:t>Converted</w:t>
             </w:r>
           </w:p>
         </w:tc>
@@ -1501,16 +1492,14 @@
             <w:tcW w:w="4680" w:type="dxa"/>
           </w:tcPr>
           <w:p>
-            <w:pPr/>
-            <w:r>
-              <w:t xml:space="preserve">Placed an order after chatting</w:t>
+            <w:r>
+              <w:t>Placed an order after chatting</w:t>
             </w:r>
           </w:p>
         </w:tc>
       </w:tr>
     </w:tbl>
     <w:p>
-      <w:pPr/>
       <w:r>
         <w:t xml:space="preserve">Alongside the funnel, the dashboard shows </w:t>
       </w:r>
@@ -1518,19 +1507,18 @@
         <w:rPr>
           <w:b/>
         </w:rPr>
-        <w:t xml:space="preserve">visitors who did not open the chat</w:t>
+        <w:t>visitors who did not open the chat</w:t>
       </w:r>
       <w:r>
         <w:t xml:space="preserve"> (visitors minus those who opened it), as a count and a percentage of all visitors.</w:t>
       </w:r>
     </w:p>
     <w:p>
-      <w:pPr/>
-      <w:r>
-        <w:rPr>
-          <w:b/>
-        </w:rPr>
-        <w:t xml:space="preserve">Done when:</w:t>
+      <w:r>
+        <w:rPr>
+          <w:b/>
+        </w:rPr>
+        <w:t>Done when:</w:t>
       </w:r>
       <w:r>
         <w:t xml:space="preserve"> for any date range, an admin can see all six stage counts, the drop-off between each stage, and the number of visitors who never opened the chat.</w:t>
@@ -1541,16 +1529,15 @@
         <w:pStyle w:val="Heading3"/>
       </w:pPr>
       <w:r>
-        <w:t xml:space="preserve">2. Orders and revenue</w:t>
-      </w:r>
-    </w:p>
-    <w:p>
-      <w:pPr/>
+        <w:t>2. Orders and revenue</w:t>
+      </w:r>
+    </w:p>
+    <w:p>
       <w:r>
         <w:rPr>
           <w:i/>
         </w:rPr>
-        <w:t xml:space="preserve">As an admin, I want to see orders and revenue over time, so I know how much business the chatbot brings in.</w:t>
+        <w:t>As an admin, I want to see orders and revenue over time, so I know how much business the chatbot brings in.</w:t>
       </w:r>
     </w:p>
     <w:p>
@@ -1565,7 +1552,7 @@
         <w:rPr>
           <w:b/>
         </w:rPr>
-        <w:t xml:space="preserve">Total orders</w:t>
+        <w:t>Total orders</w:t>
       </w:r>
       <w:r>
         <w:t xml:space="preserve"> and </w:t>
@@ -1574,7 +1561,7 @@
         <w:rPr>
           <w:b/>
         </w:rPr>
-        <w:t xml:space="preserve">total revenue</w:t>
+        <w:t>total revenue</w:t>
       </w:r>
       <w:r>
         <w:t xml:space="preserve"> from customers who chatted.</w:t>
@@ -1592,7 +1579,7 @@
         <w:rPr>
           <w:b/>
         </w:rPr>
-        <w:t xml:space="preserve">View by:</w:t>
+        <w:t>View by:</w:t>
       </w:r>
       <w:r>
         <w:t xml:space="preserve"> Daily, Weekly or Monthly, shown as a trend over time.</w:t>
@@ -1610,7 +1597,7 @@
         <w:rPr>
           <w:b/>
         </w:rPr>
-        <w:t xml:space="preserve">Custom filter:</w:t>
+        <w:t>Custom filter:</w:t>
       </w:r>
       <w:r>
         <w:t xml:space="preserve"> pick any start and end date.</w:t>
@@ -1625,7 +1612,7 @@
         </w:numPr>
       </w:pPr>
       <w:r>
-        <w:t xml:space="preserve">The selected date range also applies to the funnel, so all numbers on the dashboard match.</w:t>
+        <w:t>The selected date range also applies to the funnel, so all numbers on the dashboard match.</w:t>
       </w:r>
     </w:p>
     <w:p>
@@ -1637,16 +1624,15 @@
         </w:numPr>
       </w:pPr>
       <w:r>
-        <w:t xml:space="preserve">Every number on the dashboard can be downloaded as a spreadsheet.</w:t>
-      </w:r>
-    </w:p>
-    <w:p>
-      <w:pPr/>
-      <w:r>
-        <w:rPr>
-          <w:b/>
-        </w:rPr>
-        <w:t xml:space="preserve">Done when:</w:t>
+        <w:t>Every number on the dashboard can be downloaded as a spreadsheet.</w:t>
+      </w:r>
+    </w:p>
+    <w:p>
+      <w:r>
+        <w:rPr>
+          <w:b/>
+        </w:rPr>
+        <w:t>Done when:</w:t>
       </w:r>
       <w:r>
         <w:t xml:space="preserve"> an admin can switch between daily, weekly and monthly views, pick a custom date range, and see orders and revenue for that period.</w:t>
@@ -1655,16 +1641,105 @@
     <w:sectPr>
       <w:pgSz w:w="12240" w:h="15840"/>
       <w:pgMar w:top="1440" w:right="1440" w:bottom="1440" w:left="1440" w:header="720" w:footer="720" w:gutter="0"/>
+      <w:cols w:space="720"/>
     </w:sectPr>
   </w:body>
 </w:document>
 </file>
 
 <file path=word/numbering.xml><?xml version="1.0" encoding="utf-8"?>
-<w:numbering xmlns:w="http://schemas.openxmlformats.org/wordprocessingml/2006/main">
-  <w:abstractNum w:abstractNumId="0">
+<w:numbering xmlns:wpc="http://schemas.microsoft.com/office/word/2010/wordprocessingCanvas" xmlns:cx="http://schemas.microsoft.com/office/drawing/2014/chartex" xmlns:cx1="http://schemas.microsoft.com/office/drawing/2015/9/8/chartex" xmlns:cx2="http://schemas.microsoft.com/office/drawing/2015/10/21/chartex" xmlns:cx3="http://schemas.microsoft.com/office/drawing/2016/5/9/chartex" xmlns:cx4="http://schemas.microsoft.com/office/drawing/2016/5/10/chartex" xmlns:cx5="http://schemas.microsoft.com/office/drawing/2016/5/11/chartex" xmlns:cx6="http://schemas.microsoft.com/office/drawing/2016/5/12/chartex" xmlns:cx7="http://schemas.microsoft.com/office/drawing/2016/5/13/chartex" xmlns:cx8="http://schemas.microsoft.com/office/drawing/2016/5/14/chartex" xmlns:mc="http://schemas.openxmlformats.org/markup-compatibility/2006" xmlns:aink="http://schemas.microsoft.com/office/drawing/2016/ink" xmlns:am3d="http://schemas.microsoft.com/office/drawing/2017/model3d" xmlns:o="urn:schemas-microsoft-com:office:office" xmlns:oel="http://schemas.microsoft.com/office/2019/extlst" xmlns:r="http://schemas.openxmlformats.org/officeDocument/2006/relationships" xmlns:m="http://schemas.openxmlformats.org/officeDocument/2006/math" xmlns:v="urn:schemas-microsoft-com:vml" xmlns:wp14="http://schemas.microsoft.com/office/word/2010/wordprocessingDrawing" xmlns:wp="http://schemas.openxmlformats.org/drawingml/2006/wordprocessingDrawing" xmlns:w10="urn:schemas-microsoft-com:office:word" xmlns:w="http://schemas.openxmlformats.org/wordprocessingml/2006/main" xmlns:w14="http://schemas.microsoft.com/office/word/2010/wordml" xmlns:w15="http://schemas.microsoft.com/office/word/2012/wordml" xmlns:w16cex="http://schemas.microsoft.com/office/word/2018/wordml/cex" xmlns:w16cid="http://schemas.microsoft.com/office/word/2016/wordml/cid" xmlns:w16="http://schemas.microsoft.com/office/word/2018/wordml" xmlns:w16du="http://schemas.microsoft.com/office/word/2023/wordml/word16du" xmlns:w16sdtdh="http://schemas.microsoft.com/office/word/2020/wordml/sdtdatahash" xmlns:w16sdtfl="http://schemas.microsoft.com/office/word/2024/wordml/sdtformatlock" xmlns:w16se="http://schemas.microsoft.com/office/word/2015/wordml/symex" xmlns:wpg="http://schemas.microsoft.com/office/word/2010/wordprocessingGroup" xmlns:wpi="http://schemas.microsoft.com/office/word/2010/wordprocessingInk" xmlns:wne="http://schemas.microsoft.com/office/word/2006/wordml" xmlns:wps="http://schemas.microsoft.com/office/word/2010/wordprocessingShape" mc:Ignorable="w14 w15 w16se w16cid w16 w16cex w16sdtdh w16sdtfl w16du wp14">
+  <w:abstractNum w:abstractNumId="0" w15:restartNumberingAfterBreak="0">
+    <w:nsid w:val="387A5603"/>
     <w:multiLevelType w:val="hybridMultilevel"/>
-    <w:lvl w:ilvl="0">
+    <w:tmpl w:val="D0107DFE"/>
+    <w:lvl w:ilvl="0" w:tplc="EB94456A">
+      <w:start w:val="1"/>
+      <w:numFmt w:val="decimal"/>
+      <w:lvlText w:val="%1."/>
+      <w:lvlJc w:val="left"/>
+      <w:pPr>
+        <w:ind w:left="720" w:hanging="360"/>
+      </w:pPr>
+    </w:lvl>
+    <w:lvl w:ilvl="1" w:tplc="525C0806">
+      <w:start w:val="1"/>
+      <w:numFmt w:val="lowerLetter"/>
+      <w:lvlText w:val="%2."/>
+      <w:lvlJc w:val="left"/>
+      <w:pPr>
+        <w:ind w:left="1440" w:hanging="360"/>
+      </w:pPr>
+    </w:lvl>
+    <w:lvl w:ilvl="2" w:tplc="2424DA06">
+      <w:start w:val="1"/>
+      <w:numFmt w:val="lowerRoman"/>
+      <w:lvlText w:val="%3."/>
+      <w:lvlJc w:val="left"/>
+      <w:pPr>
+        <w:ind w:left="2160" w:hanging="360"/>
+      </w:pPr>
+    </w:lvl>
+    <w:lvl w:ilvl="3" w:tplc="D79ADB36">
+      <w:start w:val="1"/>
+      <w:numFmt w:val="decimal"/>
+      <w:lvlText w:val="%4."/>
+      <w:lvlJc w:val="left"/>
+      <w:pPr>
+        <w:ind w:left="2880" w:hanging="360"/>
+      </w:pPr>
+    </w:lvl>
+    <w:lvl w:ilvl="4" w:tplc="5A2A88AA">
+      <w:start w:val="1"/>
+      <w:numFmt w:val="lowerLetter"/>
+      <w:lvlText w:val="%5."/>
+      <w:lvlJc w:val="left"/>
+      <w:pPr>
+        <w:ind w:left="3600" w:hanging="360"/>
+      </w:pPr>
+    </w:lvl>
+    <w:lvl w:ilvl="5" w:tplc="5BEE3792">
+      <w:start w:val="1"/>
+      <w:numFmt w:val="lowerRoman"/>
+      <w:lvlText w:val="%6."/>
+      <w:lvlJc w:val="left"/>
+      <w:pPr>
+        <w:ind w:left="4320" w:hanging="360"/>
+      </w:pPr>
+    </w:lvl>
+    <w:lvl w:ilvl="6" w:tplc="60728016">
+      <w:start w:val="1"/>
+      <w:numFmt w:val="decimal"/>
+      <w:lvlText w:val="%7."/>
+      <w:lvlJc w:val="left"/>
+      <w:pPr>
+        <w:ind w:left="5040" w:hanging="360"/>
+      </w:pPr>
+    </w:lvl>
+    <w:lvl w:ilvl="7" w:tplc="7020EA5C">
+      <w:start w:val="1"/>
+      <w:numFmt w:val="lowerLetter"/>
+      <w:lvlText w:val="%8."/>
+      <w:lvlJc w:val="left"/>
+      <w:pPr>
+        <w:ind w:left="5760" w:hanging="360"/>
+      </w:pPr>
+    </w:lvl>
+    <w:lvl w:ilvl="8" w:tplc="781A2330">
+      <w:start w:val="1"/>
+      <w:numFmt w:val="lowerRoman"/>
+      <w:lvlText w:val="%9."/>
+      <w:lvlJc w:val="left"/>
+      <w:pPr>
+        <w:ind w:left="6480" w:hanging="360"/>
+      </w:pPr>
+    </w:lvl>
+  </w:abstractNum>
+  <w:abstractNum w:abstractNumId="1" w15:restartNumberingAfterBreak="0">
+    <w:nsid w:val="56A300E6"/>
+    <w:multiLevelType w:val="hybridMultilevel"/>
+    <w:tmpl w:val="365279E8"/>
+    <w:lvl w:ilvl="0" w:tplc="3A38FB92">
       <w:start w:val="1"/>
       <w:numFmt w:val="bullet"/>
       <w:lvlText w:val="•"/>
@@ -1673,7 +1748,7 @@
         <w:ind w:left="720" w:hanging="360"/>
       </w:pPr>
     </w:lvl>
-    <w:lvl w:ilvl="1">
+    <w:lvl w:ilvl="1" w:tplc="BB068FD6">
       <w:start w:val="1"/>
       <w:numFmt w:val="bullet"/>
       <w:lvlText w:val="o"/>
@@ -1682,7 +1757,7 @@
         <w:ind w:left="1440" w:hanging="360"/>
       </w:pPr>
     </w:lvl>
-    <w:lvl w:ilvl="2">
+    <w:lvl w:ilvl="2" w:tplc="758E2B26">
       <w:start w:val="1"/>
       <w:numFmt w:val="bullet"/>
       <w:lvlText w:val="▪"/>
@@ -1691,7 +1766,7 @@
         <w:ind w:left="2160" w:hanging="360"/>
       </w:pPr>
     </w:lvl>
-    <w:lvl w:ilvl="3">
+    <w:lvl w:ilvl="3" w:tplc="B77456DC">
       <w:start w:val="1"/>
       <w:numFmt w:val="bullet"/>
       <w:lvlText w:val="•"/>
@@ -1700,7 +1775,7 @@
         <w:ind w:left="2880" w:hanging="360"/>
       </w:pPr>
     </w:lvl>
-    <w:lvl w:ilvl="4">
+    <w:lvl w:ilvl="4" w:tplc="89505554">
       <w:start w:val="1"/>
       <w:numFmt w:val="bullet"/>
       <w:lvlText w:val="o"/>
@@ -1709,7 +1784,7 @@
         <w:ind w:left="3600" w:hanging="360"/>
       </w:pPr>
     </w:lvl>
-    <w:lvl w:ilvl="5">
+    <w:lvl w:ilvl="5" w:tplc="04BC08F2">
       <w:start w:val="1"/>
       <w:numFmt w:val="bullet"/>
       <w:lvlText w:val="▪"/>
@@ -1718,7 +1793,7 @@
         <w:ind w:left="4320" w:hanging="360"/>
       </w:pPr>
     </w:lvl>
-    <w:lvl w:ilvl="6">
+    <w:lvl w:ilvl="6" w:tplc="B0CCFD52">
       <w:start w:val="1"/>
       <w:numFmt w:val="bullet"/>
       <w:lvlText w:val="•"/>
@@ -1727,7 +1802,7 @@
         <w:ind w:left="5040" w:hanging="360"/>
       </w:pPr>
     </w:lvl>
-    <w:lvl w:ilvl="7">
+    <w:lvl w:ilvl="7" w:tplc="BC382798">
       <w:start w:val="1"/>
       <w:numFmt w:val="bullet"/>
       <w:lvlText w:val="o"/>
@@ -1736,7 +1811,7 @@
         <w:ind w:left="5760" w:hanging="360"/>
       </w:pPr>
     </w:lvl>
-    <w:lvl w:ilvl="8">
+    <w:lvl w:ilvl="8" w:tplc="6FC8B5F2">
       <w:start w:val="1"/>
       <w:numFmt w:val="bullet"/>
       <w:lvlText w:val="▪"/>
@@ -1746,141 +1821,57 @@
       </w:pPr>
     </w:lvl>
   </w:abstractNum>
-  <w:abstractNum w:abstractNumId="1">
-    <w:multiLevelType w:val="hybridMultilevel"/>
-    <w:lvl w:ilvl="0">
-      <w:start w:val="1"/>
-      <w:numFmt w:val="decimal"/>
-      <w:lvlText w:val="%1."/>
-      <w:lvlJc w:val="left"/>
-      <w:pPr>
-        <w:ind w:left="720" w:hanging="360"/>
-      </w:pPr>
-    </w:lvl>
-    <w:lvl w:ilvl="1">
-      <w:start w:val="1"/>
-      <w:numFmt w:val="lowerLetter"/>
-      <w:lvlText w:val="%2."/>
-      <w:lvlJc w:val="left"/>
-      <w:pPr>
-        <w:ind w:left="1440" w:hanging="360"/>
-      </w:pPr>
-    </w:lvl>
-    <w:lvl w:ilvl="2">
-      <w:start w:val="1"/>
-      <w:numFmt w:val="lowerRoman"/>
-      <w:lvlText w:val="%3."/>
-      <w:lvlJc w:val="left"/>
-      <w:pPr>
-        <w:ind w:left="2160" w:hanging="360"/>
-      </w:pPr>
-    </w:lvl>
-    <w:lvl w:ilvl="3">
-      <w:start w:val="1"/>
-      <w:numFmt w:val="decimal"/>
-      <w:lvlText w:val="%4."/>
-      <w:lvlJc w:val="left"/>
-      <w:pPr>
-        <w:ind w:left="2880" w:hanging="360"/>
-      </w:pPr>
-    </w:lvl>
-    <w:lvl w:ilvl="4">
-      <w:start w:val="1"/>
-      <w:numFmt w:val="lowerLetter"/>
-      <w:lvlText w:val="%5."/>
-      <w:lvlJc w:val="left"/>
-      <w:pPr>
-        <w:ind w:left="3600" w:hanging="360"/>
-      </w:pPr>
-    </w:lvl>
-    <w:lvl w:ilvl="5">
-      <w:start w:val="1"/>
-      <w:numFmt w:val="lowerRoman"/>
-      <w:lvlText w:val="%6."/>
-      <w:lvlJc w:val="left"/>
-      <w:pPr>
-        <w:ind w:left="4320" w:hanging="360"/>
-      </w:pPr>
-    </w:lvl>
-    <w:lvl w:ilvl="6">
-      <w:start w:val="1"/>
-      <w:numFmt w:val="decimal"/>
-      <w:lvlText w:val="%7."/>
-      <w:lvlJc w:val="left"/>
-      <w:pPr>
-        <w:ind w:left="5040" w:hanging="360"/>
-      </w:pPr>
-    </w:lvl>
-    <w:lvl w:ilvl="7">
-      <w:start w:val="1"/>
-      <w:numFmt w:val="lowerLetter"/>
-      <w:lvlText w:val="%8."/>
-      <w:lvlJc w:val="left"/>
-      <w:pPr>
-        <w:ind w:left="5760" w:hanging="360"/>
-      </w:pPr>
-    </w:lvl>
-    <w:lvl w:ilvl="8">
-      <w:start w:val="1"/>
-      <w:numFmt w:val="lowerRoman"/>
-      <w:lvlText w:val="%9."/>
-      <w:lvlJc w:val="left"/>
-      <w:pPr>
-        <w:ind w:left="6480" w:hanging="360"/>
-      </w:pPr>
-    </w:lvl>
-  </w:abstractNum>
-  <w:num w:numId="1">
+  <w:num w:numId="1" w16cid:durableId="582107400">
+    <w:abstractNumId w:val="1"/>
+  </w:num>
+  <w:num w:numId="2" w16cid:durableId="1120762020">
     <w:abstractNumId w:val="0"/>
-  </w:num>
-  <w:num w:numId="2">
-    <w:abstractNumId w:val="1"/>
     <w:lvlOverride w:ilvl="0">
       <w:startOverride w:val="1"/>
     </w:lvlOverride>
   </w:num>
-  <w:num w:numId="3">
+  <w:num w:numId="3" w16cid:durableId="1216744465">
+    <w:abstractNumId w:val="1"/>
+  </w:num>
+  <w:num w:numId="4" w16cid:durableId="1359501955">
+    <w:abstractNumId w:val="1"/>
+  </w:num>
+  <w:num w:numId="5" w16cid:durableId="1781414824">
+    <w:abstractNumId w:val="1"/>
+  </w:num>
+  <w:num w:numId="6" w16cid:durableId="1924097178">
+    <w:abstractNumId w:val="1"/>
+  </w:num>
+  <w:num w:numId="7" w16cid:durableId="1091505301">
     <w:abstractNumId w:val="0"/>
-  </w:num>
-  <w:num w:numId="4">
-    <w:abstractNumId w:val="0"/>
-  </w:num>
-  <w:num w:numId="5">
-    <w:abstractNumId w:val="0"/>
-  </w:num>
-  <w:num w:numId="6">
-    <w:abstractNumId w:val="0"/>
-  </w:num>
-  <w:num w:numId="7">
-    <w:abstractNumId w:val="1"/>
     <w:lvlOverride w:ilvl="0">
       <w:startOverride w:val="1"/>
     </w:lvlOverride>
   </w:num>
-  <w:num w:numId="8">
-    <w:abstractNumId w:val="0"/>
+  <w:num w:numId="8" w16cid:durableId="1459563952">
+    <w:abstractNumId w:val="1"/>
   </w:num>
-  <w:num w:numId="9">
-    <w:abstractNumId w:val="0"/>
+  <w:num w:numId="9" w16cid:durableId="1955360720">
+    <w:abstractNumId w:val="1"/>
   </w:num>
-  <w:num w:numId="10">
-    <w:abstractNumId w:val="0"/>
+  <w:num w:numId="10" w16cid:durableId="1877697171">
+    <w:abstractNumId w:val="1"/>
   </w:num>
-  <w:num w:numId="11">
-    <w:abstractNumId w:val="0"/>
+  <w:num w:numId="11" w16cid:durableId="1077478814">
+    <w:abstractNumId w:val="1"/>
   </w:num>
 </w:numbering>
 </file>
 
 <file path=word/styles.xml><?xml version="1.0" encoding="utf-8"?>
-<w:styles xmlns:w="http://schemas.openxmlformats.org/wordprocessingml/2006/main">
+<w:styles xmlns:mc="http://schemas.openxmlformats.org/markup-compatibility/2006" xmlns:r="http://schemas.openxmlformats.org/officeDocument/2006/relationships" xmlns:w="http://schemas.openxmlformats.org/wordprocessingml/2006/main" xmlns:w14="http://schemas.microsoft.com/office/word/2010/wordml" xmlns:w15="http://schemas.microsoft.com/office/word/2012/wordml" xmlns:w16cex="http://schemas.microsoft.com/office/word/2018/wordml/cex" xmlns:w16cid="http://schemas.microsoft.com/office/word/2016/wordml/cid" xmlns:w16="http://schemas.microsoft.com/office/word/2018/wordml" xmlns:w16du="http://schemas.microsoft.com/office/word/2023/wordml/word16du" xmlns:w16sdtdh="http://schemas.microsoft.com/office/word/2020/wordml/sdtdatahash" xmlns:w16sdtfl="http://schemas.microsoft.com/office/word/2024/wordml/sdtformatlock" xmlns:w16se="http://schemas.microsoft.com/office/word/2015/wordml/symex" mc:Ignorable="w14 w15 w16se w16cid w16 w16cex w16sdtdh w16sdtfl w16du">
   <w:docDefaults>
     <w:rPrDefault>
       <w:rPr>
-        <w:rFonts w:ascii="Calibri" w:hAnsi="Calibri" w:eastAsia="Calibri" w:cs="Calibri"/>
+        <w:rFonts w:ascii="Calibri" w:eastAsia="Calibri" w:hAnsi="Calibri" w:cs="Calibri"/>
         <w:sz w:val="22"/>
         <w:szCs w:val="22"/>
-        <w:lang w:val="en-US"/>
+        <w:lang w:val="en-US" w:eastAsia="en-US" w:bidi="ar-SA"/>
       </w:rPr>
     </w:rPrDefault>
     <w:pPrDefault>
@@ -1889,6 +1880,384 @@
       </w:pPr>
     </w:pPrDefault>
   </w:docDefaults>
+  <w:latentStyles w:defLockedState="0" w:defUIPriority="99" w:defSemiHidden="0" w:defUnhideWhenUsed="0" w:defQFormat="0" w:count="376">
+    <w:lsdException w:name="Normal" w:uiPriority="0" w:qFormat="1"/>
+    <w:lsdException w:name="heading 1" w:uiPriority="9" w:qFormat="1"/>
+    <w:lsdException w:name="heading 2" w:semiHidden="1" w:uiPriority="9" w:unhideWhenUsed="1" w:qFormat="1"/>
+    <w:lsdException w:name="heading 3" w:semiHidden="1" w:uiPriority="9" w:unhideWhenUsed="1" w:qFormat="1"/>
+    <w:lsdException w:name="heading 4" w:semiHidden="1" w:uiPriority="9" w:unhideWhenUsed="1" w:qFormat="1"/>
+    <w:lsdException w:name="heading 5" w:semiHidden="1" w:uiPriority="9" w:unhideWhenUsed="1" w:qFormat="1"/>
+    <w:lsdException w:name="heading 6" w:semiHidden="1" w:uiPriority="9" w:unhideWhenUsed="1" w:qFormat="1"/>
+    <w:lsdException w:name="heading 7" w:semiHidden="1" w:uiPriority="9" w:unhideWhenUsed="1" w:qFormat="1"/>
+    <w:lsdException w:name="heading 8" w:semiHidden="1" w:uiPriority="9" w:unhideWhenUsed="1" w:qFormat="1"/>
+    <w:lsdException w:name="heading 9" w:semiHidden="1" w:uiPriority="9" w:unhideWhenUsed="1" w:qFormat="1"/>
+    <w:lsdException w:name="index 1" w:semiHidden="1" w:unhideWhenUsed="1"/>
+    <w:lsdException w:name="index 2" w:semiHidden="1" w:unhideWhenUsed="1"/>
+    <w:lsdException w:name="index 3" w:semiHidden="1" w:unhideWhenUsed="1"/>
+    <w:lsdException w:name="index 4" w:semiHidden="1" w:unhideWhenUsed="1"/>
+    <w:lsdException w:name="index 5" w:semiHidden="1" w:unhideWhenUsed="1"/>
+    <w:lsdException w:name="index 6" w:semiHidden="1" w:unhideWhenUsed="1"/>
+    <w:lsdException w:name="index 7" w:semiHidden="1" w:unhideWhenUsed="1"/>
+    <w:lsdException w:name="index 8" w:semiHidden="1" w:unhideWhenUsed="1"/>
+    <w:lsdException w:name="index 9" w:semiHidden="1" w:unhideWhenUsed="1"/>
+    <w:lsdException w:name="toc 1" w:semiHidden="1" w:uiPriority="39" w:unhideWhenUsed="1"/>
+    <w:lsdException w:name="toc 2" w:semiHidden="1" w:uiPriority="39" w:unhideWhenUsed="1"/>
+    <w:lsdException w:name="toc 3" w:semiHidden="1" w:uiPriority="39" w:unhideWhenUsed="1"/>
+    <w:lsdException w:name="toc 4" w:semiHidden="1" w:uiPriority="39" w:unhideWhenUsed="1"/>
+    <w:lsdException w:name="toc 5" w:semiHidden="1" w:uiPriority="39" w:unhideWhenUsed="1"/>
+    <w:lsdException w:name="toc 6" w:semiHidden="1" w:uiPriority="39" w:unhideWhenUsed="1"/>
+    <w:lsdException w:name="toc 7" w:semiHidden="1" w:uiPriority="39" w:unhideWhenUsed="1"/>
+    <w:lsdException w:name="toc 8" w:semiHidden="1" w:uiPriority="39" w:unhideWhenUsed="1"/>
+    <w:lsdException w:name="toc 9" w:semiHidden="1" w:uiPriority="39" w:unhideWhenUsed="1"/>
+    <w:lsdException w:name="Normal Indent" w:semiHidden="1" w:unhideWhenUsed="1"/>
+    <w:lsdException w:name="footnote text" w:semiHidden="1" w:unhideWhenUsed="1"/>
+    <w:lsdException w:name="annotation text" w:semiHidden="1" w:unhideWhenUsed="1"/>
+    <w:lsdException w:name="header" w:semiHidden="1" w:unhideWhenUsed="1"/>
+    <w:lsdException w:name="footer" w:semiHidden="1" w:unhideWhenUsed="1"/>
+    <w:lsdException w:name="index heading" w:semiHidden="1" w:unhideWhenUsed="1"/>
+    <w:lsdException w:name="caption" w:semiHidden="1" w:uiPriority="35" w:unhideWhenUsed="1" w:qFormat="1"/>
+    <w:lsdException w:name="table of figures" w:semiHidden="1" w:unhideWhenUsed="1"/>
+    <w:lsdException w:name="envelope address" w:semiHidden="1" w:unhideWhenUsed="1"/>
+    <w:lsdException w:name="envelope return" w:semiHidden="1" w:unhideWhenUsed="1"/>
+    <w:lsdException w:name="footnote reference" w:semiHidden="1" w:unhideWhenUsed="1"/>
+    <w:lsdException w:name="annotation reference" w:semiHidden="1" w:unhideWhenUsed="1"/>
+    <w:lsdException w:name="line number" w:semiHidden="1" w:unhideWhenUsed="1"/>
+    <w:lsdException w:name="page number" w:semiHidden="1" w:unhideWhenUsed="1"/>
+    <w:lsdException w:name="endnote reference" w:semiHidden="1" w:unhideWhenUsed="1"/>
+    <w:lsdException w:name="endnote text" w:semiHidden="1" w:unhideWhenUsed="1"/>
+    <w:lsdException w:name="table of authorities" w:semiHidden="1" w:unhideWhenUsed="1"/>
+    <w:lsdException w:name="macro" w:semiHidden="1" w:unhideWhenUsed="1"/>
+    <w:lsdException w:name="toa heading" w:semiHidden="1" w:unhideWhenUsed="1"/>
+    <w:lsdException w:name="List" w:semiHidden="1" w:unhideWhenUsed="1"/>
+    <w:lsdException w:name="List Bullet" w:semiHidden="1" w:unhideWhenUsed="1"/>
+    <w:lsdException w:name="List Number" w:semiHidden="1" w:unhideWhenUsed="1"/>
+    <w:lsdException w:name="List 2" w:semiHidden="1" w:unhideWhenUsed="1"/>
+    <w:lsdException w:name="List 3" w:semiHidden="1" w:unhideWhenUsed="1"/>
+    <w:lsdException w:name="List 4" w:semiHidden="1" w:unhideWhenUsed="1"/>
+    <w:lsdException w:name="List 5" w:semiHidden="1" w:unhideWhenUsed="1"/>
+    <w:lsdException w:name="List Bullet 2" w:semiHidden="1" w:unhideWhenUsed="1"/>
+    <w:lsdException w:name="List Bullet 3" w:semiHidden="1" w:unhideWhenUsed="1"/>
+    <w:lsdException w:name="List Bullet 4" w:semiHidden="1" w:unhideWhenUsed="1"/>
+    <w:lsdException w:name="List Bullet 5" w:semiHidden="1" w:unhideWhenUsed="1"/>
+    <w:lsdException w:name="List Number 2" w:semiHidden="1" w:unhideWhenUsed="1"/>
+    <w:lsdException w:name="List Number 3" w:semiHidden="1" w:unhideWhenUsed="1"/>
+    <w:lsdException w:name="List Number 4" w:semiHidden="1" w:unhideWhenUsed="1"/>
+    <w:lsdException w:name="List Number 5" w:semiHidden="1" w:unhideWhenUsed="1"/>
+    <w:lsdException w:name="Title" w:uiPriority="10" w:qFormat="1"/>
+    <w:lsdException w:name="Closing" w:semiHidden="1" w:unhideWhenUsed="1"/>
+    <w:lsdException w:name="Signature" w:semiHidden="1" w:unhideWhenUsed="1"/>
+    <w:lsdException w:name="Default Paragraph Font" w:semiHidden="1" w:uiPriority="1" w:unhideWhenUsed="1"/>
+    <w:lsdException w:name="Body Text" w:semiHidden="1" w:unhideWhenUsed="1"/>
+    <w:lsdException w:name="Body Text Indent" w:semiHidden="1" w:unhideWhenUsed="1"/>
+    <w:lsdException w:name="List Continue" w:semiHidden="1" w:unhideWhenUsed="1"/>
+    <w:lsdException w:name="List Continue 2" w:semiHidden="1" w:unhideWhenUsed="1"/>
+    <w:lsdException w:name="List Continue 3" w:semiHidden="1" w:unhideWhenUsed="1"/>
+    <w:lsdException w:name="List Continue 4" w:semiHidden="1" w:unhideWhenUsed="1"/>
+    <w:lsdException w:name="List Continue 5" w:semiHidden="1" w:unhideWhenUsed="1"/>
+    <w:lsdException w:name="Message Header" w:semiHidden="1" w:unhideWhenUsed="1"/>
+    <w:lsdException w:name="Subtitle" w:uiPriority="11" w:qFormat="1"/>
+    <w:lsdException w:name="Salutation" w:semiHidden="1" w:unhideWhenUsed="1"/>
+    <w:lsdException w:name="Date" w:semiHidden="1" w:unhideWhenUsed="1"/>
+    <w:lsdException w:name="Body Text First Indent" w:semiHidden="1" w:unhideWhenUsed="1"/>
+    <w:lsdException w:name="Body Text First Indent 2" w:semiHidden="1" w:unhideWhenUsed="1"/>
+    <w:lsdException w:name="Note Heading" w:semiHidden="1" w:unhideWhenUsed="1"/>
+    <w:lsdException w:name="Body Text 2" w:semiHidden="1" w:unhideWhenUsed="1"/>
+    <w:lsdException w:name="Body Text 3" w:semiHidden="1" w:unhideWhenUsed="1"/>
+    <w:lsdException w:name="Body Text Indent 2" w:semiHidden="1" w:unhideWhenUsed="1"/>
+    <w:lsdException w:name="Body Text Indent 3" w:semiHidden="1" w:unhideWhenUsed="1"/>
+    <w:lsdException w:name="Block Text" w:semiHidden="1" w:unhideWhenUsed="1"/>
+    <w:lsdException w:name="Hyperlink" w:semiHidden="1" w:unhideWhenUsed="1"/>
+    <w:lsdException w:name="FollowedHyperlink" w:semiHidden="1" w:unhideWhenUsed="1"/>
+    <w:lsdException w:name="Strong" w:uiPriority="22" w:qFormat="1"/>
+    <w:lsdException w:name="Emphasis" w:uiPriority="20" w:qFormat="1"/>
+    <w:lsdException w:name="Document Map" w:semiHidden="1" w:unhideWhenUsed="1"/>
+    <w:lsdException w:name="Plain Text" w:semiHidden="1" w:unhideWhenUsed="1"/>
+    <w:lsdException w:name="E-mail Signature" w:semiHidden="1" w:unhideWhenUsed="1"/>
+    <w:lsdException w:name="HTML Top of Form" w:semiHidden="1" w:unhideWhenUsed="1"/>
+    <w:lsdException w:name="HTML Bottom of Form" w:semiHidden="1" w:unhideWhenUsed="1"/>
+    <w:lsdException w:name="Normal (Web)" w:semiHidden="1" w:unhideWhenUsed="1"/>
+    <w:lsdException w:name="HTML Acronym" w:semiHidden="1" w:unhideWhenUsed="1"/>
+    <w:lsdException w:name="HTML Address" w:semiHidden="1" w:unhideWhenUsed="1"/>
+    <w:lsdException w:name="HTML Cite" w:semiHidden="1" w:unhideWhenUsed="1"/>
+    <w:lsdException w:name="HTML Code" w:semiHidden="1" w:unhideWhenUsed="1"/>
+    <w:lsdException w:name="HTML Definition" w:semiHidden="1" w:unhideWhenUsed="1"/>
+    <w:lsdException w:name="HTML Keyboard" w:semiHidden="1" w:unhideWhenUsed="1"/>
+    <w:lsdException w:name="HTML Preformatted" w:semiHidden="1" w:unhideWhenUsed="1"/>
+    <w:lsdException w:name="HTML Sample" w:semiHidden="1" w:unhideWhenUsed="1"/>
+    <w:lsdException w:name="HTML Typewriter" w:semiHidden="1" w:unhideWhenUsed="1"/>
+    <w:lsdException w:name="HTML Variable" w:semiHidden="1" w:unhideWhenUsed="1"/>
+    <w:lsdException w:name="Normal Table" w:semiHidden="1" w:unhideWhenUsed="1"/>
+    <w:lsdException w:name="annotation subject" w:semiHidden="1" w:unhideWhenUsed="1"/>
+    <w:lsdException w:name="No List" w:semiHidden="1" w:unhideWhenUsed="1"/>
+    <w:lsdException w:name="Outline List 1" w:semiHidden="1" w:unhideWhenUsed="1"/>
+    <w:lsdException w:name="Outline List 2" w:semiHidden="1" w:unhideWhenUsed="1"/>
+    <w:lsdException w:name="Outline List 3" w:semiHidden="1" w:unhideWhenUsed="1"/>
+    <w:lsdException w:name="Table Simple 1" w:semiHidden="1" w:unhideWhenUsed="1"/>
+    <w:lsdException w:name="Table Simple 2" w:semiHidden="1" w:unhideWhenUsed="1"/>
+    <w:lsdException w:name="Table Simple 3" w:semiHidden="1" w:unhideWhenUsed="1"/>
+    <w:lsdException w:name="Table Classic 1" w:semiHidden="1" w:unhideWhenUsed="1"/>
+    <w:lsdException w:name="Table Classic 2" w:semiHidden="1" w:unhideWhenUsed="1"/>
+    <w:lsdException w:name="Table Classic 3" w:semiHidden="1" w:unhideWhenUsed="1"/>
+    <w:lsdException w:name="Table Classic 4" w:semiHidden="1" w:unhideWhenUsed="1"/>
+    <w:lsdException w:name="Table Colorful 1" w:semiHidden="1" w:unhideWhenUsed="1"/>
+    <w:lsdException w:name="Table Colorful 2" w:semiHidden="1" w:unhideWhenUsed="1"/>
+    <w:lsdException w:name="Table Colorful 3" w:semiHidden="1" w:unhideWhenUsed="1"/>
+    <w:lsdException w:name="Table Columns 1" w:semiHidden="1" w:unhideWhenUsed="1"/>
+    <w:lsdException w:name="Table Columns 2" w:semiHidden="1" w:unhideWhenUsed="1"/>
+    <w:lsdException w:name="Table Columns 3" w:semiHidden="1" w:unhideWhenUsed="1"/>
+    <w:lsdException w:name="Table Columns 4" w:semiHidden="1" w:unhideWhenUsed="1"/>
+    <w:lsdException w:name="Table Columns 5" w:semiHidden="1" w:unhideWhenUsed="1"/>
+    <w:lsdException w:name="Table Grid 1" w:semiHidden="1" w:unhideWhenUsed="1"/>
+    <w:lsdException w:name="Table Grid 2" w:semiHidden="1" w:unhideWhenUsed="1"/>
+    <w:lsdException w:name="Table Grid 3" w:semiHidden="1" w:unhideWhenUsed="1"/>
+    <w:lsdException w:name="Table Grid 4" w:semiHidden="1" w:unhideWhenUsed="1"/>
+    <w:lsdException w:name="Table Grid 5" w:semiHidden="1" w:unhideWhenUsed="1"/>
+    <w:lsdException w:name="Table Grid 6" w:semiHidden="1" w:unhideWhenUsed="1"/>
+    <w:lsdException w:name="Table Grid 7" w:semiHidden="1" w:unhideWhenUsed="1"/>
+    <w:lsdException w:name="Table Grid 8" w:semiHidden="1" w:unhideWhenUsed="1"/>
+    <w:lsdException w:name="Table List 1" w:semiHidden="1" w:unhideWhenUsed="1"/>
+    <w:lsdException w:name="Table List 2" w:semiHidden="1" w:unhideWhenUsed="1"/>
+    <w:lsdException w:name="Table List 3" w:semiHidden="1" w:unhideWhenUsed="1"/>
+    <w:lsdException w:name="Table List 4" w:semiHidden="1" w:unhideWhenUsed="1"/>
+    <w:lsdException w:name="Table List 5" w:semiHidden="1" w:unhideWhenUsed="1"/>
+    <w:lsdException w:name="Table List 6" w:semiHidden="1" w:unhideWhenUsed="1"/>
+    <w:lsdException w:name="Table List 7" w:semiHidden="1" w:unhideWhenUsed="1"/>
+    <w:lsdException w:name="Table List 8" w:semiHidden="1" w:unhideWhenUsed="1"/>
+    <w:lsdException w:name="Table 3D effects 1" w:semiHidden="1" w:unhideWhenUsed="1"/>
+    <w:lsdException w:name="Table 3D effects 2" w:semiHidden="1" w:unhideWhenUsed="1"/>
+    <w:lsdException w:name="Table 3D effects 3" w:semiHidden="1" w:unhideWhenUsed="1"/>
+    <w:lsdException w:name="Table Contemporary" w:semiHidden="1" w:unhideWhenUsed="1"/>
+    <w:lsdException w:name="Table Elegant" w:semiHidden="1" w:unhideWhenUsed="1"/>
+    <w:lsdException w:name="Table Professional" w:semiHidden="1" w:unhideWhenUsed="1"/>
+    <w:lsdException w:name="Table Subtle 1" w:semiHidden="1" w:unhideWhenUsed="1"/>
+    <w:lsdException w:name="Table Subtle 2" w:semiHidden="1" w:unhideWhenUsed="1"/>
+    <w:lsdException w:name="Table Web 1" w:semiHidden="1" w:unhideWhenUsed="1"/>
+    <w:lsdException w:name="Table Web 2" w:semiHidden="1" w:unhideWhenUsed="1"/>
+    <w:lsdException w:name="Table Web 3" w:semiHidden="1" w:unhideWhenUsed="1"/>
+    <w:lsdException w:name="Balloon Text" w:semiHidden="1" w:unhideWhenUsed="1"/>
+    <w:lsdException w:name="Table Grid" w:uiPriority="39"/>
+    <w:lsdException w:name="Table Theme" w:semiHidden="1" w:unhideWhenUsed="1"/>
+    <w:lsdException w:name="Placeholder Text" w:semiHidden="1"/>
+    <w:lsdException w:name="No Spacing" w:uiPriority="1" w:qFormat="1"/>
+    <w:lsdException w:name="Light Shading" w:uiPriority="60"/>
+    <w:lsdException w:name="Light List" w:uiPriority="61"/>
+    <w:lsdException w:name="Light Grid" w:uiPriority="62"/>
+    <w:lsdException w:name="Medium Shading 1" w:uiPriority="63"/>
+    <w:lsdException w:name="Medium Shading 2" w:uiPriority="64"/>
+    <w:lsdException w:name="Medium List 1" w:uiPriority="65"/>
+    <w:lsdException w:name="Medium List 2" w:uiPriority="66"/>
+    <w:lsdException w:name="Medium Grid 1" w:uiPriority="67"/>
+    <w:lsdException w:name="Medium Grid 2" w:uiPriority="68"/>
+    <w:lsdException w:name="Medium Grid 3" w:uiPriority="69"/>
+    <w:lsdException w:name="Dark List" w:uiPriority="70"/>
+    <w:lsdException w:name="Colorful Shading" w:uiPriority="71"/>
+    <w:lsdException w:name="Colorful List" w:uiPriority="72"/>
+    <w:lsdException w:name="Colorful Grid" w:uiPriority="73"/>
+    <w:lsdException w:name="Light Shading Accent 1" w:uiPriority="60"/>
+    <w:lsdException w:name="Light List Accent 1" w:uiPriority="61"/>
+    <w:lsdException w:name="Light Grid Accent 1" w:uiPriority="62"/>
+    <w:lsdException w:name="Medium Shading 1 Accent 1" w:uiPriority="63"/>
+    <w:lsdException w:name="Medium Shading 2 Accent 1" w:uiPriority="64"/>
+    <w:lsdException w:name="Medium List 1 Accent 1" w:uiPriority="65"/>
+    <w:lsdException w:name="Revision" w:semiHidden="1"/>
+    <w:lsdException w:name="List Paragraph" w:uiPriority="34" w:qFormat="1"/>
+    <w:lsdException w:name="Quote" w:uiPriority="29" w:qFormat="1"/>
+    <w:lsdException w:name="Intense Quote" w:uiPriority="30" w:qFormat="1"/>
+    <w:lsdException w:name="Medium List 2 Accent 1" w:uiPriority="66"/>
+    <w:lsdException w:name="Medium Grid 1 Accent 1" w:uiPriority="67"/>
+    <w:lsdException w:name="Medium Grid 2 Accent 1" w:uiPriority="68"/>
+    <w:lsdException w:name="Medium Grid 3 Accent 1" w:uiPriority="69"/>
+    <w:lsdException w:name="Dark List Accent 1" w:uiPriority="70"/>
+    <w:lsdException w:name="Colorful Shading Accent 1" w:uiPriority="71"/>
+    <w:lsdException w:name="Colorful List Accent 1" w:uiPriority="72"/>
+    <w:lsdException w:name="Colorful Grid Accent 1" w:uiPriority="73"/>
+    <w:lsdException w:name="Light Shading Accent 2" w:uiPriority="60"/>
+    <w:lsdException w:name="Light List Accent 2" w:uiPriority="61"/>
+    <w:lsdException w:name="Light Grid Accent 2" w:uiPriority="62"/>
+    <w:lsdException w:name="Medium Shading 1 Accent 2" w:uiPriority="63"/>
+    <w:lsdException w:name="Medium Shading 2 Accent 2" w:uiPriority="64"/>
+    <w:lsdException w:name="Medium List 1 Accent 2" w:uiPriority="65"/>
+    <w:lsdException w:name="Medium List 2 Accent 2" w:uiPriority="66"/>
+    <w:lsdException w:name="Medium Grid 1 Accent 2" w:uiPriority="67"/>
+    <w:lsdException w:name="Medium Grid 2 Accent 2" w:uiPriority="68"/>
+    <w:lsdException w:name="Medium Grid 3 Accent 2" w:uiPriority="69"/>
+    <w:lsdException w:name="Dark List Accent 2" w:uiPriority="70"/>
+    <w:lsdException w:name="Colorful Shading Accent 2" w:uiPriority="71"/>
+    <w:lsdException w:name="Colorful List Accent 2" w:uiPriority="72"/>
+    <w:lsdException w:name="Colorful Grid Accent 2" w:uiPriority="73"/>
+    <w:lsdException w:name="Light Shading Accent 3" w:uiPriority="60"/>
+    <w:lsdException w:name="Light List Accent 3" w:uiPriority="61"/>
+    <w:lsdException w:name="Light Grid Accent 3" w:uiPriority="62"/>
+    <w:lsdException w:name="Medium Shading 1 Accent 3" w:uiPriority="63"/>
+    <w:lsdException w:name="Medium Shading 2 Accent 3" w:uiPriority="64"/>
+    <w:lsdException w:name="Medium List 1 Accent 3" w:uiPriority="65"/>
+    <w:lsdException w:name="Medium List 2 Accent 3" w:uiPriority="66"/>
+    <w:lsdException w:name="Medium Grid 1 Accent 3" w:uiPriority="67"/>
+    <w:lsdException w:name="Medium Grid 2 Accent 3" w:uiPriority="68"/>
+    <w:lsdException w:name="Medium Grid 3 Accent 3" w:uiPriority="69"/>
+    <w:lsdException w:name="Dark List Accent 3" w:uiPriority="70"/>
+    <w:lsdException w:name="Colorful Shading Accent 3" w:uiPriority="71"/>
+    <w:lsdException w:name="Colorful List Accent 3" w:uiPriority="72"/>
+    <w:lsdException w:name="Colorful Grid Accent 3" w:uiPriority="73"/>
+    <w:lsdException w:name="Light Shading Accent 4" w:uiPriority="60"/>
+    <w:lsdException w:name="Light List Accent 4" w:uiPriority="61"/>
+    <w:lsdException w:name="Light Grid Accent 4" w:uiPriority="62"/>
+    <w:lsdException w:name="Medium Shading 1 Accent 4" w:uiPriority="63"/>
+    <w:lsdException w:name="Medium Shading 2 Accent 4" w:uiPriority="64"/>
+    <w:lsdException w:name="Medium List 1 Accent 4" w:uiPriority="65"/>
+    <w:lsdException w:name="Medium List 2 Accent 4" w:uiPriority="66"/>
+    <w:lsdException w:name="Medium Grid 1 Accent 4" w:uiPriority="67"/>
+    <w:lsdException w:name="Medium Grid 2 Accent 4" w:uiPriority="68"/>
+    <w:lsdException w:name="Medium Grid 3 Accent 4" w:uiPriority="69"/>
+    <w:lsdException w:name="Dark List Accent 4" w:uiPriority="70"/>
+    <w:lsdException w:name="Colorful Shading Accent 4" w:uiPriority="71"/>
+    <w:lsdException w:name="Colorful List Accent 4" w:uiPriority="72"/>
+    <w:lsdException w:name="Colorful Grid Accent 4" w:uiPriority="73"/>
+    <w:lsdException w:name="Light Shading Accent 5" w:uiPriority="60"/>
+    <w:lsdException w:name="Light List Accent 5" w:uiPriority="61"/>
+    <w:lsdException w:name="Light Grid Accent 5" w:uiPriority="62"/>
+    <w:lsdException w:name="Medium Shading 1 Accent 5" w:uiPriority="63"/>
+    <w:lsdException w:name="Medium Shading 2 Accent 5" w:uiPriority="64"/>
+    <w:lsdException w:name="Medium List 1 Accent 5" w:uiPriority="65"/>
+    <w:lsdException w:name="Medium List 2 Accent 5" w:uiPriority="66"/>
+    <w:lsdException w:name="Medium Grid 1 Accent 5" w:uiPriority="67"/>
+    <w:lsdException w:name="Medium Grid 2 Accent 5" w:uiPriority="68"/>
+    <w:lsdException w:name="Medium Grid 3 Accent 5" w:uiPriority="69"/>
+    <w:lsdException w:name="Dark List Accent 5" w:uiPriority="70"/>
+    <w:lsdException w:name="Colorful Shading Accent 5" w:uiPriority="71"/>
+    <w:lsdException w:name="Colorful List Accent 5" w:uiPriority="72"/>
+    <w:lsdException w:name="Colorful Grid Accent 5" w:uiPriority="73"/>
+    <w:lsdException w:name="Light Shading Accent 6" w:uiPriority="60"/>
+    <w:lsdException w:name="Light List Accent 6" w:uiPriority="61"/>
+    <w:lsdException w:name="Light Grid Accent 6" w:uiPriority="62"/>
+    <w:lsdException w:name="Medium Shading 1 Accent 6" w:uiPriority="63"/>
+    <w:lsdException w:name="Medium Shading 2 Accent 6" w:uiPriority="64"/>
+    <w:lsdException w:name="Medium List 1 Accent 6" w:uiPriority="65"/>
+    <w:lsdException w:name="Medium List 2 Accent 6" w:uiPriority="66"/>
+    <w:lsdException w:name="Medium Grid 1 Accent 6" w:uiPriority="67"/>
+    <w:lsdException w:name="Medium Grid 2 Accent 6" w:uiPriority="68"/>
+    <w:lsdException w:name="Medium Grid 3 Accent 6" w:uiPriority="69"/>
+    <w:lsdException w:name="Dark List Accent 6" w:uiPriority="70"/>
+    <w:lsdException w:name="Colorful Shading Accent 6" w:uiPriority="71"/>
+    <w:lsdException w:name="Colorful List Accent 6" w:uiPriority="72"/>
+    <w:lsdException w:name="Colorful Grid Accent 6" w:uiPriority="73"/>
+    <w:lsdException w:name="Subtle Emphasis" w:uiPriority="19" w:qFormat="1"/>
+    <w:lsdException w:name="Intense Emphasis" w:uiPriority="21" w:qFormat="1"/>
+    <w:lsdException w:name="Subtle Reference" w:uiPriority="31" w:qFormat="1"/>
+    <w:lsdException w:name="Intense Reference" w:uiPriority="32" w:qFormat="1"/>
+    <w:lsdException w:name="Book Title" w:uiPriority="33" w:qFormat="1"/>
+    <w:lsdException w:name="Bibliography" w:semiHidden="1" w:uiPriority="37" w:unhideWhenUsed="1"/>
+    <w:lsdException w:name="TOC Heading" w:semiHidden="1" w:uiPriority="39" w:unhideWhenUsed="1" w:qFormat="1"/>
+    <w:lsdException w:name="Plain Table 1" w:uiPriority="41"/>
+    <w:lsdException w:name="Plain Table 2" w:uiPriority="42"/>
+    <w:lsdException w:name="Plain Table 3" w:uiPriority="43"/>
+    <w:lsdException w:name="Plain Table 4" w:uiPriority="44"/>
+    <w:lsdException w:name="Plain Table 5" w:uiPriority="45"/>
+    <w:lsdException w:name="Grid Table Light" w:uiPriority="40"/>
+    <w:lsdException w:name="Grid Table 1 Light" w:uiPriority="46"/>
+    <w:lsdException w:name="Grid Table 2" w:uiPriority="47"/>
+    <w:lsdException w:name="Grid Table 3" w:uiPriority="48"/>
+    <w:lsdException w:name="Grid Table 4" w:uiPriority="49"/>
+    <w:lsdException w:name="Grid Table 5 Dark" w:uiPriority="50"/>
+    <w:lsdException w:name="Grid Table 6 Colorful" w:uiPriority="51"/>
+    <w:lsdException w:name="Grid Table 7 Colorful" w:uiPriority="52"/>
+    <w:lsdException w:name="Grid Table 1 Light Accent 1" w:uiPriority="46"/>
+    <w:lsdException w:name="Grid Table 2 Accent 1" w:uiPriority="47"/>
+    <w:lsdException w:name="Grid Table 3 Accent 1" w:uiPriority="48"/>
+    <w:lsdException w:name="Grid Table 4 Accent 1" w:uiPriority="49"/>
+    <w:lsdException w:name="Grid Table 5 Dark Accent 1" w:uiPriority="50"/>
+    <w:lsdException w:name="Grid Table 6 Colorful Accent 1" w:uiPriority="51"/>
+    <w:lsdException w:name="Grid Table 7 Colorful Accent 1" w:uiPriority="52"/>
+    <w:lsdException w:name="Grid Table 1 Light Accent 2" w:uiPriority="46"/>
+    <w:lsdException w:name="Grid Table 2 Accent 2" w:uiPriority="47"/>
+    <w:lsdException w:name="Grid Table 3 Accent 2" w:uiPriority="48"/>
+    <w:lsdException w:name="Grid Table 4 Accent 2" w:uiPriority="49"/>
+    <w:lsdException w:name="Grid Table 5 Dark Accent 2" w:uiPriority="50"/>
+    <w:lsdException w:name="Grid Table 6 Colorful Accent 2" w:uiPriority="51"/>
+    <w:lsdException w:name="Grid Table 7 Colorful Accent 2" w:uiPriority="52"/>
+    <w:lsdException w:name="Grid Table 1 Light Accent 3" w:uiPriority="46"/>
+    <w:lsdException w:name="Grid Table 2 Accent 3" w:uiPriority="47"/>
+    <w:lsdException w:name="Grid Table 3 Accent 3" w:uiPriority="48"/>
+    <w:lsdException w:name="Grid Table 4 Accent 3" w:uiPriority="49"/>
+    <w:lsdException w:name="Grid Table 5 Dark Accent 3" w:uiPriority="50"/>
+    <w:lsdException w:name="Grid Table 6 Colorful Accent 3" w:uiPriority="51"/>
+    <w:lsdException w:name="Grid Table 7 Colorful Accent 3" w:uiPriority="52"/>
+    <w:lsdException w:name="Grid Table 1 Light Accent 4" w:uiPriority="46"/>
+    <w:lsdException w:name="Grid Table 2 Accent 4" w:uiPriority="47"/>
+    <w:lsdException w:name="Grid Table 3 Accent 4" w:uiPriority="48"/>
+    <w:lsdException w:name="Grid Table 4 Accent 4" w:uiPriority="49"/>
+    <w:lsdException w:name="Grid Table 5 Dark Accent 4" w:uiPriority="50"/>
+    <w:lsdException w:name="Grid Table 6 Colorful Accent 4" w:uiPriority="51"/>
+    <w:lsdException w:name="Grid Table 7 Colorful Accent 4" w:uiPriority="52"/>
+    <w:lsdException w:name="Grid Table 1 Light Accent 5" w:uiPriority="46"/>
+    <w:lsdException w:name="Grid Table 2 Accent 5" w:uiPriority="47"/>
+    <w:lsdException w:name="Grid Table 3 Accent 5" w:uiPriority="48"/>
+    <w:lsdException w:name="Grid Table 4 Accent 5" w:uiPriority="49"/>
+    <w:lsdException w:name="Grid Table 5 Dark Accent 5" w:uiPriority="50"/>
+    <w:lsdException w:name="Grid Table 6 Colorful Accent 5" w:uiPriority="51"/>
+    <w:lsdException w:name="Grid Table 7 Colorful Accent 5" w:uiPriority="52"/>
+    <w:lsdException w:name="Grid Table 1 Light Accent 6" w:uiPriority="46"/>
+    <w:lsdException w:name="Grid Table 2 Accent 6" w:uiPriority="47"/>
+    <w:lsdException w:name="Grid Table 3 Accent 6" w:uiPriority="48"/>
+    <w:lsdException w:name="Grid Table 4 Accent 6" w:uiPriority="49"/>
+    <w:lsdException w:name="Grid Table 5 Dark Accent 6" w:uiPriority="50"/>
+    <w:lsdException w:name="Grid Table 6 Colorful Accent 6" w:uiPriority="51"/>
+    <w:lsdException w:name="Grid Table 7 Colorful Accent 6" w:uiPriority="52"/>
+    <w:lsdException w:name="List Table 1 Light" w:uiPriority="46"/>
+    <w:lsdException w:name="List Table 2" w:uiPriority="47"/>
+    <w:lsdException w:name="List Table 3" w:uiPriority="48"/>
+    <w:lsdException w:name="List Table 4" w:uiPriority="49"/>
+    <w:lsdException w:name="List Table 5 Dark" w:uiPriority="50"/>
+    <w:lsdException w:name="List Table 6 Colorful" w:uiPriority="51"/>
+    <w:lsdException w:name="List Table 7 Colorful" w:uiPriority="52"/>
+    <w:lsdException w:name="List Table 1 Light Accent 1" w:uiPriority="46"/>
+    <w:lsdException w:name="List Table 2 Accent 1" w:uiPriority="47"/>
+    <w:lsdException w:name="List Table 3 Accent 1" w:uiPriority="48"/>
+    <w:lsdException w:name="List Table 4 Accent 1" w:uiPriority="49"/>
+    <w:lsdException w:name="List Table 5 Dark Accent 1" w:uiPriority="50"/>
+    <w:lsdException w:name="List Table 6 Colorful Accent 1" w:uiPriority="51"/>
+    <w:lsdException w:name="List Table 7 Colorful Accent 1" w:uiPriority="52"/>
+    <w:lsdException w:name="List Table 1 Light Accent 2" w:uiPriority="46"/>
+    <w:lsdException w:name="List Table 2 Accent 2" w:uiPriority="47"/>
+    <w:lsdException w:name="List Table 3 Accent 2" w:uiPriority="48"/>
+    <w:lsdException w:name="List Table 4 Accent 2" w:uiPriority="49"/>
+    <w:lsdException w:name="List Table 5 Dark Accent 2" w:uiPriority="50"/>
+    <w:lsdException w:name="List Table 6 Colorful Accent 2" w:uiPriority="51"/>
+    <w:lsdException w:name="List Table 7 Colorful Accent 2" w:uiPriority="52"/>
+    <w:lsdException w:name="List Table 1 Light Accent 3" w:uiPriority="46"/>
+    <w:lsdException w:name="List Table 2 Accent 3" w:uiPriority="47"/>
+    <w:lsdException w:name="List Table 3 Accent 3" w:uiPriority="48"/>
+    <w:lsdException w:name="List Table 4 Accent 3" w:uiPriority="49"/>
+    <w:lsdException w:name="List Table 5 Dark Accent 3" w:uiPriority="50"/>
+    <w:lsdException w:name="List Table 6 Colorful Accent 3" w:uiPriority="51"/>
+    <w:lsdException w:name="List Table 7 Colorful Accent 3" w:uiPriority="52"/>
+    <w:lsdException w:name="List Table 1 Light Accent 4" w:uiPriority="46"/>
+    <w:lsdException w:name="List Table 2 Accent 4" w:uiPriority="47"/>
+    <w:lsdException w:name="List Table 3 Accent 4" w:uiPriority="48"/>
+    <w:lsdException w:name="List Table 4 Accent 4" w:uiPriority="49"/>
+    <w:lsdException w:name="List Table 5 Dark Accent 4" w:uiPriority="50"/>
+    <w:lsdException w:name="List Table 6 Colorful Accent 4" w:uiPriority="51"/>
+    <w:lsdException w:name="List Table 7 Colorful Accent 4" w:uiPriority="52"/>
+    <w:lsdException w:name="List Table 1 Light Accent 5" w:uiPriority="46"/>
+    <w:lsdException w:name="List Table 2 Accent 5" w:uiPriority="47"/>
+    <w:lsdException w:name="List Table 3 Accent 5" w:uiPriority="48"/>
+    <w:lsdException w:name="List Table 4 Accent 5" w:uiPriority="49"/>
+    <w:lsdException w:name="List Table 5 Dark Accent 5" w:uiPriority="50"/>
+    <w:lsdException w:name="List Table 6 Colorful Accent 5" w:uiPriority="51"/>
+    <w:lsdException w:name="List Table 7 Colorful Accent 5" w:uiPriority="52"/>
+    <w:lsdException w:name="List Table 1 Light Accent 6" w:uiPriority="46"/>
+    <w:lsdException w:name="List Table 2 Accent 6" w:uiPriority="47"/>
+    <w:lsdException w:name="List Table 3 Accent 6" w:uiPriority="48"/>
+    <w:lsdException w:name="List Table 4 Accent 6" w:uiPriority="49"/>
+    <w:lsdException w:name="List Table 5 Dark Accent 6" w:uiPriority="50"/>
+    <w:lsdException w:name="List Table 6 Colorful Accent 6" w:uiPriority="51"/>
+    <w:lsdException w:name="List Table 7 Colorful Accent 6" w:uiPriority="52"/>
+    <w:lsdException w:name="Mention" w:semiHidden="1" w:unhideWhenUsed="1"/>
+    <w:lsdException w:name="Smart Hyperlink" w:semiHidden="1" w:unhideWhenUsed="1"/>
+    <w:lsdException w:name="Hashtag" w:semiHidden="1" w:unhideWhenUsed="1"/>
+    <w:lsdException w:name="Unresolved Mention" w:semiHidden="1" w:unhideWhenUsed="1"/>
+    <w:lsdException w:name="Smart Link" w:semiHidden="1" w:unhideWhenUsed="1"/>
+  </w:latentStyles>
   <w:style w:type="paragraph" w:default="1" w:styleId="Normal">
     <w:name w:val="Normal"/>
     <w:qFormat/>
@@ -1897,6 +2266,7 @@
     <w:name w:val="heading 1"/>
     <w:basedOn w:val="Normal"/>
     <w:next w:val="Normal"/>
+    <w:uiPriority w:val="9"/>
     <w:qFormat/>
     <w:pPr>
       <w:keepNext/>
@@ -1912,6 +2282,8 @@
     <w:name w:val="heading 2"/>
     <w:basedOn w:val="Normal"/>
     <w:next w:val="Normal"/>
+    <w:uiPriority w:val="9"/>
+    <w:unhideWhenUsed/>
     <w:qFormat/>
     <w:pPr>
       <w:keepNext/>
@@ -1927,6 +2299,8 @@
     <w:name w:val="heading 3"/>
     <w:basedOn w:val="Normal"/>
     <w:next w:val="Normal"/>
+    <w:uiPriority w:val="9"/>
+    <w:unhideWhenUsed/>
     <w:qFormat/>
     <w:pPr>
       <w:keepNext/>
@@ -1942,6 +2316,9 @@
     <w:name w:val="heading 4"/>
     <w:basedOn w:val="Normal"/>
     <w:next w:val="Normal"/>
+    <w:uiPriority w:val="9"/>
+    <w:semiHidden/>
+    <w:unhideWhenUsed/>
     <w:qFormat/>
     <w:pPr>
       <w:keepNext/>
@@ -1949,13 +2326,15 @@
     </w:pPr>
     <w:rPr>
       <w:b/>
-      <w:sz w:val="22"/>
     </w:rPr>
   </w:style>
   <w:style w:type="paragraph" w:styleId="Heading5">
     <w:name w:val="heading 5"/>
     <w:basedOn w:val="Normal"/>
     <w:next w:val="Normal"/>
+    <w:uiPriority w:val="9"/>
+    <w:semiHidden/>
+    <w:unhideWhenUsed/>
     <w:qFormat/>
     <w:pPr>
       <w:keepNext/>
@@ -1963,13 +2342,15 @@
     </w:pPr>
     <w:rPr>
       <w:b/>
-      <w:sz w:val="22"/>
     </w:rPr>
   </w:style>
   <w:style w:type="paragraph" w:styleId="Heading6">
     <w:name w:val="heading 6"/>
     <w:basedOn w:val="Normal"/>
     <w:next w:val="Normal"/>
+    <w:uiPriority w:val="9"/>
+    <w:semiHidden/>
+    <w:unhideWhenUsed/>
     <w:qFormat/>
     <w:pPr>
       <w:keepNext/>
@@ -1977,13 +2358,40 @@
     </w:pPr>
     <w:rPr>
       <w:i/>
-      <w:sz w:val="22"/>
     </w:rPr>
+  </w:style>
+  <w:style w:type="character" w:default="1" w:styleId="DefaultParagraphFont">
+    <w:name w:val="Default Paragraph Font"/>
+    <w:uiPriority w:val="1"/>
+    <w:semiHidden/>
+    <w:unhideWhenUsed/>
+  </w:style>
+  <w:style w:type="table" w:default="1" w:styleId="TableNormal">
+    <w:name w:val="Normal Table"/>
+    <w:uiPriority w:val="99"/>
+    <w:semiHidden/>
+    <w:unhideWhenUsed/>
+    <w:tblPr>
+      <w:tblInd w:w="0" w:type="dxa"/>
+      <w:tblCellMar>
+        <w:top w:w="0" w:type="dxa"/>
+        <w:left w:w="108" w:type="dxa"/>
+        <w:bottom w:w="0" w:type="dxa"/>
+        <w:right w:w="108" w:type="dxa"/>
+      </w:tblCellMar>
+    </w:tblPr>
+  </w:style>
+  <w:style w:type="numbering" w:default="1" w:styleId="NoList">
+    <w:name w:val="No List"/>
+    <w:uiPriority w:val="99"/>
+    <w:semiHidden/>
+    <w:unhideWhenUsed/>
   </w:style>
   <w:style w:type="paragraph" w:styleId="Title">
     <w:name w:val="Title"/>
     <w:basedOn w:val="Normal"/>
     <w:next w:val="Normal"/>
+    <w:uiPriority w:val="10"/>
     <w:qFormat/>
     <w:pPr>
       <w:spacing w:after="80"/>
@@ -1998,35 +2406,35 @@
     <w:basedOn w:val="Normal"/>
     <w:qFormat/>
     <w:pPr>
-      <w:ind w:left="720" w:right="720"/>
       <w:pBdr>
         <w:left w:val="single" w:sz="12" w:space="8" w:color="A0A0A0"/>
       </w:pBdr>
+      <w:ind w:left="720" w:right="720"/>
     </w:pPr>
     <w:rPr>
       <w:i/>
       <w:color w:val="404040"/>
     </w:rPr>
   </w:style>
-  <w:style w:type="paragraph" w:styleId="Code">
+  <w:style w:type="paragraph" w:customStyle="1" w:styleId="Code">
     <w:name w:val="Code"/>
     <w:basedOn w:val="Normal"/>
     <w:link w:val="CodeChar"/>
     <w:pPr>
+      <w:shd w:val="clear" w:color="auto" w:fill="F5F5F5"/>
       <w:spacing w:after="0" w:line="240" w:lineRule="auto"/>
       <w:contextualSpacing/>
-      <w:shd w:val="clear" w:color="auto" w:fill="F5F5F5"/>
     </w:pPr>
     <w:rPr>
-      <w:rFonts w:ascii="Consolas" w:hAnsi="Consolas" w:eastAsia="Consolas" w:cs="Consolas"/>
+      <w:rFonts w:ascii="Consolas" w:eastAsia="Consolas" w:hAnsi="Consolas" w:cs="Consolas"/>
       <w:sz w:val="20"/>
     </w:rPr>
   </w:style>
-  <w:style w:type="character" w:styleId="CodeChar">
+  <w:style w:type="character" w:customStyle="1" w:styleId="CodeChar">
     <w:name w:val="Code Char"/>
     <w:link w:val="Code"/>
     <w:rPr>
-      <w:rFonts w:ascii="Consolas" w:hAnsi="Consolas" w:eastAsia="Consolas" w:cs="Consolas"/>
+      <w:rFonts w:ascii="Consolas" w:eastAsia="Consolas" w:hAnsi="Consolas" w:cs="Consolas"/>
       <w:sz w:val="20"/>
       <w:shd w:val="clear" w:color="auto" w:fill="F5F5F5"/>
     </w:rPr>
@@ -2050,7 +2458,6 @@
   <w:style w:type="paragraph" w:styleId="CommentText">
     <w:name w:val="annotation text"/>
     <w:basedOn w:val="Normal"/>
-    <w:link w:val="CommentTextChar"/>
     <w:pPr>
       <w:spacing w:line="240" w:lineRule="auto"/>
     </w:pPr>
@@ -2065,18 +2472,6 @@
       <w:sz w:val="16"/>
       <w:szCs w:val="16"/>
     </w:rPr>
-  </w:style>
-  <w:style w:type="table" w:default="1" w:styleId="TableNormal">
-    <w:name w:val="Normal Table"/>
-    <w:tblPr>
-      <w:tblInd w:w="0" w:type="dxa"/>
-      <w:tblCellMar>
-        <w:top w:w="0" w:type="dxa"/>
-        <w:left w:w="108" w:type="dxa"/>
-        <w:bottom w:w="0" w:type="dxa"/>
-        <w:right w:w="108" w:type="dxa"/>
-      </w:tblCellMar>
-    </w:tblPr>
   </w:style>
   <w:style w:type="table" w:styleId="TableGrid">
     <w:name w:val="Table Grid"/>
@@ -2093,4 +2488,319 @@
     </w:tblPr>
   </w:style>
 </w:styles>
+</file>
+
+<file path=word/theme/theme1.xml><?xml version="1.0" encoding="utf-8"?>
+<a:theme xmlns:a="http://schemas.openxmlformats.org/drawingml/2006/main" name="Office Theme">
+  <a:themeElements>
+    <a:clrScheme name="Office">
+      <a:dk1>
+        <a:sysClr val="windowText" lastClr="000000"/>
+      </a:dk1>
+      <a:lt1>
+        <a:sysClr val="window" lastClr="FFFFFF"/>
+      </a:lt1>
+      <a:dk2>
+        <a:srgbClr val="0E2841"/>
+      </a:dk2>
+      <a:lt2>
+        <a:srgbClr val="E8E8E8"/>
+      </a:lt2>
+      <a:accent1>
+        <a:srgbClr val="156082"/>
+      </a:accent1>
+      <a:accent2>
+        <a:srgbClr val="E97132"/>
+      </a:accent2>
+      <a:accent3>
+        <a:srgbClr val="196B24"/>
+      </a:accent3>
+      <a:accent4>
+        <a:srgbClr val="0F9ED5"/>
+      </a:accent4>
+      <a:accent5>
+        <a:srgbClr val="A02B93"/>
+      </a:accent5>
+      <a:accent6>
+        <a:srgbClr val="4EA72E"/>
+      </a:accent6>
+      <a:hlink>
+        <a:srgbClr val="467886"/>
+      </a:hlink>
+      <a:folHlink>
+        <a:srgbClr val="96607D"/>
+      </a:folHlink>
+    </a:clrScheme>
+    <a:fontScheme name="Office">
+      <a:majorFont>
+        <a:latin typeface="Aptos Display" panose="02110004020202020204"/>
+        <a:ea typeface=""/>
+        <a:cs typeface=""/>
+        <a:font script="Jpan" typeface="游ゴシック Light"/>
+        <a:font script="Hang" typeface="맑은 고딕"/>
+        <a:font script="Hans" typeface="等线 Light"/>
+        <a:font script="Hant" typeface="新細明體"/>
+        <a:font script="Arab" typeface="Times New Roman"/>
+        <a:font script="Hebr" typeface="Times New Roman"/>
+        <a:font script="Thai" typeface="Angsana New"/>
+        <a:font script="Ethi" typeface="Nyala"/>
+        <a:font script="Beng" typeface="Vrinda"/>
+        <a:font script="Gujr" typeface="Shruti"/>
+        <a:font script="Khmr" typeface="MoolBoran"/>
+        <a:font script="Knda" typeface="Tunga"/>
+        <a:font script="Guru" typeface="Raavi"/>
+        <a:font script="Cans" typeface="Euphemia"/>
+        <a:font script="Cher" typeface="Plantagenet Cherokee"/>
+        <a:font script="Yiii" typeface="Microsoft Yi Baiti"/>
+        <a:font script="Tibt" typeface="Microsoft Himalaya"/>
+        <a:font script="Thaa" typeface="MV Boli"/>
+        <a:font script="Deva" typeface="Mangal"/>
+        <a:font script="Telu" typeface="Gautami"/>
+        <a:font script="Taml" typeface="Latha"/>
+        <a:font script="Syrc" typeface="Estrangelo Edessa"/>
+        <a:font script="Orya" typeface="Kalinga"/>
+        <a:font script="Mlym" typeface="Kartika"/>
+        <a:font script="Laoo" typeface="DokChampa"/>
+        <a:font script="Sinh" typeface="Iskoola Pota"/>
+        <a:font script="Mong" typeface="Mongolian Baiti"/>
+        <a:font script="Viet" typeface="Times New Roman"/>
+        <a:font script="Uigh" typeface="Microsoft Uighur"/>
+        <a:font script="Geor" typeface="Sylfaen"/>
+        <a:font script="Armn" typeface="Arial"/>
+        <a:font script="Bugi" typeface="Leelawadee UI"/>
+        <a:font script="Bopo" typeface="Microsoft JhengHei"/>
+        <a:font script="Java" typeface="Javanese Text"/>
+        <a:font script="Lisu" typeface="Segoe UI"/>
+        <a:font script="Mymr" typeface="Myanmar Text"/>
+        <a:font script="Nkoo" typeface="Ebrima"/>
+        <a:font script="Olck" typeface="Nirmala UI"/>
+        <a:font script="Osma" typeface="Ebrima"/>
+        <a:font script="Phag" typeface="Phagspa"/>
+        <a:font script="Syrn" typeface="Estrangelo Edessa"/>
+        <a:font script="Syrj" typeface="Estrangelo Edessa"/>
+        <a:font script="Syre" typeface="Estrangelo Edessa"/>
+        <a:font script="Sora" typeface="Nirmala UI"/>
+        <a:font script="Tale" typeface="Microsoft Tai Le"/>
+        <a:font script="Talu" typeface="Microsoft New Tai Lue"/>
+        <a:font script="Tfng" typeface="Ebrima"/>
+      </a:majorFont>
+      <a:minorFont>
+        <a:latin typeface="Aptos" panose="02110004020202020204"/>
+        <a:ea typeface=""/>
+        <a:cs typeface=""/>
+        <a:font script="Jpan" typeface="游明朝"/>
+        <a:font script="Hang" typeface="맑은 고딕"/>
+        <a:font script="Hans" typeface="等线"/>
+        <a:font script="Hant" typeface="新細明體"/>
+        <a:font script="Arab" typeface="Arial"/>
+        <a:font script="Hebr" typeface="Arial"/>
+        <a:font script="Thai" typeface="Cordia New"/>
+        <a:font script="Ethi" typeface="Nyala"/>
+        <a:font script="Beng" typeface="Vrinda"/>
+        <a:font script="Gujr" typeface="Shruti"/>
+        <a:font script="Khmr" typeface="DaunPenh"/>
+        <a:font script="Knda" typeface="Tunga"/>
+        <a:font script="Guru" typeface="Raavi"/>
+        <a:font script="Cans" typeface="Euphemia"/>
+        <a:font script="Cher" typeface="Plantagenet Cherokee"/>
+        <a:font script="Yiii" typeface="Microsoft Yi Baiti"/>
+        <a:font script="Tibt" typeface="Microsoft Himalaya"/>
+        <a:font script="Thaa" typeface="MV Boli"/>
+        <a:font script="Deva" typeface="Mangal"/>
+        <a:font script="Telu" typeface="Gautami"/>
+        <a:font script="Taml" typeface="Latha"/>
+        <a:font script="Syrc" typeface="Estrangelo Edessa"/>
+        <a:font script="Orya" typeface="Kalinga"/>
+        <a:font script="Mlym" typeface="Kartika"/>
+        <a:font script="Laoo" typeface="DokChampa"/>
+        <a:font script="Sinh" typeface="Iskoola Pota"/>
+        <a:font script="Mong" typeface="Mongolian Baiti"/>
+        <a:font script="Viet" typeface="Arial"/>
+        <a:font script="Uigh" typeface="Microsoft Uighur"/>
+        <a:font script="Geor" typeface="Sylfaen"/>
+        <a:font script="Armn" typeface="Arial"/>
+        <a:font script="Bugi" typeface="Leelawadee UI"/>
+        <a:font script="Bopo" typeface="Microsoft JhengHei"/>
+        <a:font script="Java" typeface="Javanese Text"/>
+        <a:font script="Lisu" typeface="Segoe UI"/>
+        <a:font script="Mymr" typeface="Myanmar Text"/>
+        <a:font script="Nkoo" typeface="Ebrima"/>
+        <a:font script="Olck" typeface="Nirmala UI"/>
+        <a:font script="Osma" typeface="Ebrima"/>
+        <a:font script="Phag" typeface="Phagspa"/>
+        <a:font script="Syrn" typeface="Estrangelo Edessa"/>
+        <a:font script="Syrj" typeface="Estrangelo Edessa"/>
+        <a:font script="Syre" typeface="Estrangelo Edessa"/>
+        <a:font script="Sora" typeface="Nirmala UI"/>
+        <a:font script="Tale" typeface="Microsoft Tai Le"/>
+        <a:font script="Talu" typeface="Microsoft New Tai Lue"/>
+        <a:font script="Tfng" typeface="Ebrima"/>
+      </a:minorFont>
+    </a:fontScheme>
+    <a:fmtScheme name="Office">
+      <a:fillStyleLst>
+        <a:solidFill>
+          <a:schemeClr val="phClr"/>
+        </a:solidFill>
+        <a:gradFill rotWithShape="1">
+          <a:gsLst>
+            <a:gs pos="0">
+              <a:schemeClr val="phClr">
+                <a:lumMod val="110000"/>
+                <a:satMod val="105000"/>
+                <a:tint val="67000"/>
+              </a:schemeClr>
+            </a:gs>
+            <a:gs pos="50000">
+              <a:schemeClr val="phClr">
+                <a:lumMod val="105000"/>
+                <a:satMod val="103000"/>
+                <a:tint val="73000"/>
+              </a:schemeClr>
+            </a:gs>
+            <a:gs pos="100000">
+              <a:schemeClr val="phClr">
+                <a:lumMod val="105000"/>
+                <a:satMod val="109000"/>
+                <a:tint val="81000"/>
+              </a:schemeClr>
+            </a:gs>
+          </a:gsLst>
+          <a:lin ang="5400000" scaled="0"/>
+        </a:gradFill>
+        <a:gradFill rotWithShape="1">
+          <a:gsLst>
+            <a:gs pos="0">
+              <a:schemeClr val="phClr">
+                <a:satMod val="103000"/>
+                <a:lumMod val="102000"/>
+                <a:tint val="94000"/>
+              </a:schemeClr>
+            </a:gs>
+            <a:gs pos="50000">
+              <a:schemeClr val="phClr">
+                <a:satMod val="110000"/>
+                <a:lumMod val="100000"/>
+                <a:shade val="100000"/>
+              </a:schemeClr>
+            </a:gs>
+            <a:gs pos="100000">
+              <a:schemeClr val="phClr">
+                <a:lumMod val="99000"/>
+                <a:satMod val="120000"/>
+                <a:shade val="78000"/>
+              </a:schemeClr>
+            </a:gs>
+          </a:gsLst>
+          <a:lin ang="5400000" scaled="0"/>
+        </a:gradFill>
+      </a:fillStyleLst>
+      <a:lnStyleLst>
+        <a:ln w="12700" cap="flat" cmpd="sng" algn="ctr">
+          <a:solidFill>
+            <a:schemeClr val="phClr"/>
+          </a:solidFill>
+          <a:prstDash val="solid"/>
+          <a:miter lim="800000"/>
+        </a:ln>
+        <a:ln w="19050" cap="flat" cmpd="sng" algn="ctr">
+          <a:solidFill>
+            <a:schemeClr val="phClr"/>
+          </a:solidFill>
+          <a:prstDash val="solid"/>
+          <a:miter lim="800000"/>
+        </a:ln>
+        <a:ln w="25400" cap="flat" cmpd="sng" algn="ctr">
+          <a:solidFill>
+            <a:schemeClr val="phClr"/>
+          </a:solidFill>
+          <a:prstDash val="solid"/>
+          <a:miter lim="800000"/>
+        </a:ln>
+      </a:lnStyleLst>
+      <a:effectStyleLst>
+        <a:effectStyle>
+          <a:effectLst/>
+        </a:effectStyle>
+        <a:effectStyle>
+          <a:effectLst/>
+        </a:effectStyle>
+        <a:effectStyle>
+          <a:effectLst>
+            <a:outerShdw blurRad="57150" dist="19050" dir="5400000" algn="ctr" rotWithShape="0">
+              <a:srgbClr val="000000">
+                <a:alpha val="63000"/>
+              </a:srgbClr>
+            </a:outerShdw>
+          </a:effectLst>
+        </a:effectStyle>
+      </a:effectStyleLst>
+      <a:bgFillStyleLst>
+        <a:solidFill>
+          <a:schemeClr val="phClr"/>
+        </a:solidFill>
+        <a:solidFill>
+          <a:schemeClr val="phClr">
+            <a:tint val="95000"/>
+            <a:satMod val="170000"/>
+          </a:schemeClr>
+        </a:solidFill>
+        <a:gradFill rotWithShape="1">
+          <a:gsLst>
+            <a:gs pos="0">
+              <a:schemeClr val="phClr">
+                <a:tint val="93000"/>
+                <a:satMod val="150000"/>
+                <a:shade val="98000"/>
+                <a:lumMod val="102000"/>
+              </a:schemeClr>
+            </a:gs>
+            <a:gs pos="50000">
+              <a:schemeClr val="phClr">
+                <a:tint val="98000"/>
+                <a:satMod val="130000"/>
+                <a:shade val="90000"/>
+                <a:lumMod val="103000"/>
+              </a:schemeClr>
+            </a:gs>
+            <a:gs pos="100000">
+              <a:schemeClr val="phClr">
+                <a:shade val="63000"/>
+                <a:satMod val="120000"/>
+              </a:schemeClr>
+            </a:gs>
+          </a:gsLst>
+          <a:lin ang="5400000" scaled="0"/>
+        </a:gradFill>
+      </a:bgFillStyleLst>
+    </a:fmtScheme>
+  </a:themeElements>
+  <a:objectDefaults>
+    <a:lnDef>
+      <a:spPr/>
+      <a:bodyPr/>
+      <a:lstStyle/>
+      <a:style>
+        <a:lnRef idx="2">
+          <a:schemeClr val="accent1"/>
+        </a:lnRef>
+        <a:fillRef idx="0">
+          <a:schemeClr val="accent1"/>
+        </a:fillRef>
+        <a:effectRef idx="1">
+          <a:schemeClr val="accent1"/>
+        </a:effectRef>
+        <a:fontRef idx="minor">
+          <a:schemeClr val="tx1"/>
+        </a:fontRef>
+      </a:style>
+    </a:lnDef>
+  </a:objectDefaults>
+  <a:extraClrSchemeLst/>
+  <a:extLst>
+    <a:ext uri="{05A4C25C-085E-4340-85A3-A5531E510DB2}">
+      <thm15:themeFamily xmlns:thm15="http://schemas.microsoft.com/office/thememl/2012/main" name="Office Theme" id="{2E142A2C-CD16-42D6-873A-C26D2A0506FA}" vid="{1BDDFF52-6CD6-40A5-AB3C-68EB2F1E4D0A}"/>
+    </a:ext>
+  </a:extLst>
+</a:theme>
 </file>
</xml_diff>